<commit_message>
update bakresume simp v1
</commit_message>
<xml_diff>
--- a/src/main/resources/于飞-简历-Java-10年 -all.docx
+++ b/src/main/resources/于飞-简历-Java-10年 -all.docx
@@ -1,6 +1,6 @@
 
 <file path=word/document.xml><?xml version="1.0" encoding="utf-8"?>
-<w:document xmlns:wpc="http://schemas.microsoft.com/office/word/2010/wordprocessingCanvas" xmlns:cx="http://schemas.microsoft.com/office/drawing/2014/chartex" xmlns:cx1="http://schemas.microsoft.com/office/drawing/2015/9/8/chartex" xmlns:cx2="http://schemas.microsoft.com/office/drawing/2015/10/21/chartex" xmlns:cx3="http://schemas.microsoft.com/office/drawing/2016/5/9/chartex" xmlns:cx4="http://schemas.microsoft.com/office/drawing/2016/5/10/chartex" xmlns:cx5="http://schemas.microsoft.com/office/drawing/2016/5/11/chartex" xmlns:cx6="http://schemas.microsoft.com/office/drawing/2016/5/12/chartex" xmlns:cx7="http://schemas.microsoft.com/office/drawing/2016/5/13/chartex" xmlns:cx8="http://schemas.microsoft.com/office/drawing/2016/5/14/chartex" xmlns:mc="http://schemas.openxmlformats.org/markup-compatibility/2006" xmlns:aink="http://schemas.microsoft.com/office/drawing/2016/ink" xmlns:am3d="http://schemas.microsoft.com/office/drawing/2017/model3d" xmlns:o="urn:schemas-microsoft-com:office:office" xmlns:oel="http://schemas.microsoft.com/office/2019/extlst" xmlns:r="http://schemas.openxmlformats.org/officeDocument/2006/relationships" xmlns:m="http://schemas.openxmlformats.org/officeDocument/2006/math" xmlns:v="urn:schemas-microsoft-com:vml" xmlns:wp14="http://schemas.microsoft.com/office/word/2010/wordprocessingDrawing" xmlns:wp="http://schemas.openxmlformats.org/drawingml/2006/wordprocessingDrawing" xmlns:w10="urn:schemas-microsoft-com:office:word" xmlns:w="http://schemas.openxmlformats.org/wordprocessingml/2006/main" xmlns:w14="http://schemas.microsoft.com/office/word/2010/wordml" xmlns:w15="http://schemas.microsoft.com/office/word/2012/wordml" xmlns:w16cei="http://schemas.microsoft.com/office/word/2026/wordml/cei" xmlns:w16cex="http://schemas.microsoft.com/office/word/2018/wordml/cex" xmlns:w16cid="http://schemas.microsoft.com/office/word/2016/wordml/cid" xmlns:w16="http://schemas.microsoft.com/office/word/2018/wordml" xmlns:w16du="http://schemas.microsoft.com/office/word/2023/wordml/word16du" xmlns:w16sdtdh="http://schemas.microsoft.com/office/word/2020/wordml/sdtdatahash" xmlns:w16sdtfl="http://schemas.microsoft.com/office/word/2024/wordml/sdtformatlock" xmlns:w16se="http://schemas.microsoft.com/office/word/2015/wordml/symex" xmlns:wpg="http://schemas.microsoft.com/office/word/2010/wordprocessingGroup" xmlns:wpi="http://schemas.microsoft.com/office/word/2010/wordprocessingInk" xmlns:wne="http://schemas.microsoft.com/office/word/2006/wordml" xmlns:wps="http://schemas.microsoft.com/office/word/2010/wordprocessingShape" mc:Ignorable="w14 w15 w16se w16cid w16 w16cex w16sdtdh w16sdtfl w16du wp14">
+<w:document xmlns:wpc="http://schemas.microsoft.com/office/word/2010/wordprocessingCanvas" xmlns:cx="http://schemas.microsoft.com/office/drawing/2014/chartex" xmlns:cx1="http://schemas.microsoft.com/office/drawing/2015/9/8/chartex" xmlns:cx2="http://schemas.microsoft.com/office/drawing/2015/10/21/chartex" xmlns:cx3="http://schemas.microsoft.com/office/drawing/2016/5/9/chartex" xmlns:cx4="http://schemas.microsoft.com/office/drawing/2016/5/10/chartex" xmlns:cx5="http://schemas.microsoft.com/office/drawing/2016/5/11/chartex" xmlns:cx6="http://schemas.microsoft.com/office/drawing/2016/5/12/chartex" xmlns:cx7="http://schemas.microsoft.com/office/drawing/2016/5/13/chartex" xmlns:cx8="http://schemas.microsoft.com/office/drawing/2016/5/14/chartex" xmlns:mc="http://schemas.openxmlformats.org/markup-compatibility/2006" xmlns:aink="http://schemas.microsoft.com/office/drawing/2016/ink" xmlns:am3d="http://schemas.microsoft.com/office/drawing/2017/model3d" xmlns:o="urn:schemas-microsoft-com:office:office" xmlns:oel="http://schemas.microsoft.com/office/2019/extlst" xmlns:r="http://schemas.openxmlformats.org/officeDocument/2006/relationships" xmlns:m="http://schemas.openxmlformats.org/officeDocument/2006/math" xmlns:v="urn:schemas-microsoft-com:vml" xmlns:wp14="http://schemas.microsoft.com/office/word/2010/wordprocessingDrawing" xmlns:wp="http://schemas.openxmlformats.org/drawingml/2006/wordprocessingDrawing" xmlns:w10="urn:schemas-microsoft-com:office:word" xmlns:w="http://schemas.openxmlformats.org/wordprocessingml/2006/main" xmlns:w14="http://schemas.microsoft.com/office/word/2010/wordml" xmlns:w15="http://schemas.microsoft.com/office/word/2012/wordml" xmlns:w16cex="http://schemas.microsoft.com/office/word/2018/wordml/cex" xmlns:w16cid="http://schemas.microsoft.com/office/word/2016/wordml/cid" xmlns:w16="http://schemas.microsoft.com/office/word/2018/wordml" xmlns:w16du="http://schemas.microsoft.com/office/word/2023/wordml/word16du" xmlns:w16sdtdh="http://schemas.microsoft.com/office/word/2020/wordml/sdtdatahash" xmlns:w16sdtfl="http://schemas.microsoft.com/office/word/2024/wordml/sdtformatlock" xmlns:w16se="http://schemas.microsoft.com/office/word/2015/wordml/symex" xmlns:wpg="http://schemas.microsoft.com/office/word/2010/wordprocessingGroup" xmlns:wpi="http://schemas.microsoft.com/office/word/2010/wordprocessingInk" xmlns:wne="http://schemas.microsoft.com/office/word/2006/wordml" xmlns:wps="http://schemas.microsoft.com/office/word/2010/wordprocessingShape" mc:Ignorable="w14 w15 w16se w16cid w16 w16cex w16sdtdh w16sdtfl w16du wp14">
   <w:body>
     <w:p>
       <w:pPr>
@@ -53,9 +53,12 @@
     </w:p>
     <w:p>
       <w:pPr>
+        <w:tabs>
+          <w:tab w:val="left" w:pos="5365"/>
+        </w:tabs>
         <w:spacing w:beforeLines="50" w:before="156" w:line="400" w:lineRule="exact"/>
         <w:rPr>
-          <w:rFonts w:ascii="Calibri" w:eastAsia="微软雅黑" w:hAnsi="Calibri" w:cs="Calibri"/>
+          <w:rFonts w:ascii="Calibri" w:eastAsia="微软雅黑" w:hAnsi="Calibri" w:cs="Calibri" w:hint="eastAsia"/>
           <w:color w:val="404040" w:themeColor="text1" w:themeTint="BF"/>
         </w:rPr>
       </w:pPr>
@@ -72,7 +75,90 @@
         <mc:AlternateContent>
           <mc:Choice Requires="wps">
             <w:drawing>
-              <wp:anchor distT="0" distB="0" distL="114300" distR="114300" simplePos="0" relativeHeight="251660288" behindDoc="0" locked="0" layoutInCell="1" allowOverlap="1" wp14:anchorId="624BA26F" wp14:editId="0AA37064">
+              <wp:anchor distT="0" distB="0" distL="114300" distR="114300" simplePos="0" relativeHeight="251659264" behindDoc="0" locked="0" layoutInCell="1" allowOverlap="1" wp14:anchorId="3B1B6DAB" wp14:editId="3B04126F">
+                <wp:simplePos x="0" y="0"/>
+                <wp:positionH relativeFrom="column">
+                  <wp:posOffset>714325</wp:posOffset>
+                </wp:positionH>
+                <wp:positionV relativeFrom="paragraph">
+                  <wp:posOffset>123689</wp:posOffset>
+                </wp:positionV>
+                <wp:extent cx="4603446" cy="0"/>
+                <wp:effectExtent l="0" t="19050" r="26035" b="19050"/>
+                <wp:wrapNone/>
+                <wp:docPr id="12" name="直接连接符 12"/>
+                <wp:cNvGraphicFramePr/>
+                <a:graphic xmlns:a="http://schemas.openxmlformats.org/drawingml/2006/main">
+                  <a:graphicData uri="http://schemas.microsoft.com/office/word/2010/wordprocessingShape">
+                    <wps:wsp>
+                      <wps:cNvCnPr/>
+                      <wps:spPr>
+                        <a:xfrm>
+                          <a:off x="0" y="0"/>
+                          <a:ext cx="4603446" cy="0"/>
+                        </a:xfrm>
+                        <a:prstGeom prst="line">
+                          <a:avLst/>
+                        </a:prstGeom>
+                        <a:ln w="28575">
+                          <a:solidFill>
+                            <a:schemeClr val="tx1">
+                              <a:lumMod val="50000"/>
+                              <a:lumOff val="50000"/>
+                            </a:schemeClr>
+                          </a:solidFill>
+                        </a:ln>
+                      </wps:spPr>
+                      <wps:style>
+                        <a:lnRef idx="1">
+                          <a:schemeClr val="accent1"/>
+                        </a:lnRef>
+                        <a:fillRef idx="0">
+                          <a:schemeClr val="accent1"/>
+                        </a:fillRef>
+                        <a:effectRef idx="0">
+                          <a:schemeClr val="accent1"/>
+                        </a:effectRef>
+                        <a:fontRef idx="minor">
+                          <a:schemeClr val="tx1"/>
+                        </a:fontRef>
+                      </wps:style>
+                      <wps:bodyPr/>
+                    </wps:wsp>
+                  </a:graphicData>
+                </a:graphic>
+                <wp14:sizeRelH relativeFrom="margin">
+                  <wp14:pctWidth>0</wp14:pctWidth>
+                </wp14:sizeRelH>
+                <wp14:sizeRelV relativeFrom="margin">
+                  <wp14:pctHeight>0</wp14:pctHeight>
+                </wp14:sizeRelV>
+              </wp:anchor>
+            </w:drawing>
+          </mc:Choice>
+          <mc:Fallback>
+            <w:pict>
+              <v:line w14:anchorId="118ED439" id="直接连接符 12" o:spid="_x0000_s1026" style="position:absolute;z-index:251659264;visibility:visible;mso-wrap-style:square;mso-width-percent:0;mso-height-percent:0;mso-wrap-distance-left:9pt;mso-wrap-distance-top:0;mso-wrap-distance-right:9pt;mso-wrap-distance-bottom:0;mso-position-horizontal:absolute;mso-position-horizontal-relative:text;mso-position-vertical:absolute;mso-position-vertical-relative:text;mso-width-percent:0;mso-height-percent:0;mso-width-relative:margin;mso-height-relative:margin" from="56.25pt,9.75pt" to="418.75pt,9.75pt" o:gfxdata="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" strokecolor="gray [1629]" strokeweight="2.25pt">
+                <v:stroke joinstyle="miter"/>
+              </v:line>
+            </w:pict>
+          </mc:Fallback>
+        </mc:AlternateContent>
+      </w:r>
+      <w:r>
+        <w:rPr>
+          <w:rFonts w:ascii="Calibri" w:eastAsia="微软雅黑" w:hAnsi="Calibri" w:cs="Calibri"/>
+          <w:b/>
+          <w:bCs/>
+          <w:noProof/>
+          <w:sz w:val="36"/>
+          <w:szCs w:val="36"/>
+          <w:lang w:val="zh-CN"/>
+        </w:rPr>
+        <mc:AlternateContent>
+          <mc:Choice Requires="wps">
+            <w:drawing>
+              <wp:anchor distT="0" distB="0" distL="114300" distR="114300" simplePos="0" relativeHeight="251660288" behindDoc="0" locked="0" layoutInCell="1" allowOverlap="1" wp14:anchorId="624BA26F" wp14:editId="50AE4296">
                 <wp:simplePos x="0" y="0"/>
                 <wp:positionH relativeFrom="column">
                   <wp:posOffset>584</wp:posOffset>
@@ -129,7 +215,7 @@
           </mc:Choice>
           <mc:Fallback>
             <w:pict>
-              <v:line w14:anchorId="40157883" id="直接连接符 14" o:spid="_x0000_s1026" style="position:absolute;z-index:251660288;visibility:visible;mso-wrap-style:square;mso-width-percent:0;mso-wrap-distance-left:9pt;mso-wrap-distance-top:0;mso-wrap-distance-right:9pt;mso-wrap-distance-bottom:0;mso-position-horizontal:absolute;mso-position-horizontal-relative:text;mso-position-vertical:absolute;mso-position-vertical-relative:text;mso-width-percent:0;mso-width-relative:margin" from=".05pt,9.7pt" to="55.7pt,9.7pt" o:gfxdata="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" strokecolor="#53aba1" strokeweight="2.25pt">
+              <v:line w14:anchorId="36680EF9" id="直接连接符 14" o:spid="_x0000_s1026" style="position:absolute;z-index:251660288;visibility:visible;mso-wrap-style:square;mso-width-percent:0;mso-wrap-distance-left:9pt;mso-wrap-distance-top:0;mso-wrap-distance-right:9pt;mso-wrap-distance-bottom:0;mso-position-horizontal:absolute;mso-position-horizontal-relative:text;mso-position-vertical:absolute;mso-position-vertical-relative:text;mso-width-percent:0;mso-width-relative:margin" from=".05pt,9.7pt" to="55.7pt,9.7pt" o:gfxdata="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" strokecolor="#53aba1" strokeweight="2.25pt">
                 <v:stroke joinstyle="miter"/>
               </v:line>
             </w:pict>
@@ -138,6 +224,324 @@
       </w:r>
       <w:r>
         <w:rPr>
+          <w:rFonts w:ascii="Calibri" w:eastAsia="华文细黑" w:hAnsi="Calibri" w:cs="Calibri"/>
+          <w:color w:val="404040" w:themeColor="text1" w:themeTint="BF"/>
+          <w:szCs w:val="21"/>
+        </w:rPr>
+        <w:t>姓</w:t>
+      </w:r>
+      <w:r>
+        <w:rPr>
+          <w:rFonts w:ascii="Calibri" w:eastAsia="华文细黑" w:hAnsi="Calibri" w:cs="Calibri"/>
+          <w:color w:val="404040" w:themeColor="text1" w:themeTint="BF"/>
+          <w:szCs w:val="21"/>
+        </w:rPr>
+        <w:t xml:space="preserve">    </w:t>
+      </w:r>
+      <w:r>
+        <w:rPr>
+          <w:rFonts w:ascii="Calibri" w:eastAsia="华文细黑" w:hAnsi="Calibri" w:cs="Calibri"/>
+          <w:color w:val="404040" w:themeColor="text1" w:themeTint="BF"/>
+          <w:szCs w:val="21"/>
+        </w:rPr>
+        <w:t>名：于飞</w:t>
+      </w:r>
+      <w:r>
+        <w:rPr>
+          <w:rFonts w:ascii="Calibri" w:eastAsia="华文细黑" w:hAnsi="Calibri" w:cs="Calibri"/>
+          <w:color w:val="404040" w:themeColor="text1" w:themeTint="BF"/>
+          <w:szCs w:val="21"/>
+        </w:rPr>
+        <w:t xml:space="preserve">        </w:t>
+      </w:r>
+      <w:r>
+        <w:rPr>
+          <w:rFonts w:ascii="Calibri" w:eastAsia="华文细黑" w:hAnsi="Calibri" w:cs="Calibri" w:hint="eastAsia"/>
+          <w:color w:val="404040" w:themeColor="text1" w:themeTint="BF"/>
+          <w:szCs w:val="21"/>
+        </w:rPr>
+        <w:t xml:space="preserve">    </w:t>
+      </w:r>
+      <w:r>
+        <w:rPr>
+          <w:rFonts w:ascii="Calibri" w:eastAsia="华文细黑" w:hAnsi="Calibri" w:cs="Calibri"/>
+          <w:color w:val="404040" w:themeColor="text1" w:themeTint="BF"/>
+          <w:szCs w:val="21"/>
+        </w:rPr>
+        <w:t>性别：男</w:t>
+      </w:r>
+      <w:r>
+        <w:rPr>
+          <w:rFonts w:ascii="Calibri" w:eastAsia="华文细黑" w:hAnsi="Calibri" w:cs="Calibri"/>
+          <w:color w:val="404040" w:themeColor="text1" w:themeTint="BF"/>
+          <w:szCs w:val="21"/>
+        </w:rPr>
+        <w:tab/>
+      </w:r>
+      <w:r>
+        <w:rPr>
+          <w:rFonts w:ascii="Calibri" w:eastAsia="华文细黑" w:hAnsi="Calibri" w:cs="Calibri"/>
+          <w:color w:val="404040" w:themeColor="text1" w:themeTint="BF"/>
+          <w:szCs w:val="21"/>
+        </w:rPr>
+        <w:t>工作时间：</w:t>
+      </w:r>
+      <w:r>
+        <w:rPr>
+          <w:rFonts w:ascii="Calibri" w:eastAsia="华文细黑" w:hAnsi="Calibri" w:cs="Calibri" w:hint="eastAsia"/>
+          <w:color w:val="404040" w:themeColor="text1" w:themeTint="BF"/>
+          <w:szCs w:val="21"/>
+        </w:rPr>
+        <w:t>10</w:t>
+      </w:r>
+      <w:r>
+        <w:rPr>
+          <w:rFonts w:ascii="Calibri" w:eastAsia="华文细黑" w:hAnsi="Calibri" w:cs="Calibri"/>
+          <w:color w:val="404040" w:themeColor="text1" w:themeTint="BF"/>
+          <w:szCs w:val="21"/>
+        </w:rPr>
+        <w:t>年</w:t>
+      </w:r>
+    </w:p>
+    <w:p>
+      <w:pPr>
+        <w:spacing w:line="400" w:lineRule="exact"/>
+        <w:rPr>
+          <w:rFonts w:ascii="Calibri" w:eastAsia="华文细黑" w:hAnsi="Calibri" w:cs="Calibri" w:hint="eastAsia"/>
+          <w:color w:val="404040" w:themeColor="text1" w:themeTint="BF"/>
+          <w:szCs w:val="21"/>
+        </w:rPr>
+      </w:pPr>
+      <w:r>
+        <w:rPr>
+          <w:rFonts w:ascii="Calibri" w:eastAsia="华文细黑" w:hAnsi="Calibri" w:cs="Calibri"/>
+          <w:color w:val="404040" w:themeColor="text1" w:themeTint="BF"/>
+          <w:szCs w:val="21"/>
+        </w:rPr>
+        <w:t>年</w:t>
+      </w:r>
+      <w:r>
+        <w:rPr>
+          <w:rFonts w:ascii="Calibri" w:eastAsia="华文细黑" w:hAnsi="Calibri" w:cs="Calibri"/>
+          <w:color w:val="404040" w:themeColor="text1" w:themeTint="BF"/>
+          <w:szCs w:val="21"/>
+        </w:rPr>
+        <w:t xml:space="preserve">    </w:t>
+      </w:r>
+      <w:r>
+        <w:rPr>
+          <w:rFonts w:ascii="Calibri" w:eastAsia="华文细黑" w:hAnsi="Calibri" w:cs="Calibri"/>
+          <w:color w:val="404040" w:themeColor="text1" w:themeTint="BF"/>
+          <w:szCs w:val="21"/>
+        </w:rPr>
+        <w:t>龄：</w:t>
+      </w:r>
+      <w:r>
+        <w:rPr>
+          <w:rFonts w:ascii="Calibri" w:eastAsia="华文细黑" w:hAnsi="Calibri" w:cs="Calibri" w:hint="eastAsia"/>
+          <w:color w:val="404040" w:themeColor="text1" w:themeTint="BF"/>
+          <w:szCs w:val="21"/>
+        </w:rPr>
+        <w:t>3</w:t>
+      </w:r>
+      <w:r>
+        <w:rPr>
+          <w:rFonts w:ascii="Calibri" w:eastAsia="华文细黑" w:hAnsi="Calibri" w:cs="Calibri" w:hint="eastAsia"/>
+          <w:color w:val="404040" w:themeColor="text1" w:themeTint="BF"/>
+          <w:szCs w:val="21"/>
+        </w:rPr>
+        <w:t>4</w:t>
+      </w:r>
+      <w:r>
+        <w:rPr>
+          <w:rFonts w:ascii="Calibri" w:eastAsia="华文细黑" w:hAnsi="Calibri" w:cs="Calibri"/>
+          <w:color w:val="404040" w:themeColor="text1" w:themeTint="BF"/>
+          <w:szCs w:val="21"/>
+        </w:rPr>
+        <w:t>岁</w:t>
+      </w:r>
+      <w:r>
+        <w:rPr>
+          <w:rFonts w:ascii="Calibri" w:eastAsia="华文细黑" w:hAnsi="Calibri" w:cs="Calibri"/>
+          <w:color w:val="404040" w:themeColor="text1" w:themeTint="BF"/>
+          <w:szCs w:val="21"/>
+        </w:rPr>
+        <w:t xml:space="preserve">        </w:t>
+      </w:r>
+      <w:r>
+        <w:rPr>
+          <w:rFonts w:ascii="Calibri" w:eastAsia="华文细黑" w:hAnsi="Calibri" w:cs="Calibri" w:hint="eastAsia"/>
+          <w:color w:val="404040" w:themeColor="text1" w:themeTint="BF"/>
+          <w:szCs w:val="21"/>
+        </w:rPr>
+        <w:t xml:space="preserve">   </w:t>
+      </w:r>
+      <w:r>
+        <w:rPr>
+          <w:rFonts w:ascii="Calibri" w:eastAsia="华文细黑" w:hAnsi="Calibri" w:cs="Calibri"/>
+          <w:color w:val="404040" w:themeColor="text1" w:themeTint="BF"/>
+          <w:szCs w:val="21"/>
+        </w:rPr>
+        <w:t>电话：</w:t>
+      </w:r>
+      <w:r>
+        <w:rPr>
+          <w:rFonts w:ascii="Calibri" w:eastAsia="华文细黑" w:hAnsi="Calibri" w:cs="Calibri"/>
+          <w:color w:val="404040" w:themeColor="text1" w:themeTint="BF"/>
+          <w:szCs w:val="21"/>
+        </w:rPr>
+        <w:t>135 7084 5834</w:t>
+      </w:r>
+      <w:r>
+        <w:rPr>
+          <w:rFonts w:ascii="Calibri" w:eastAsia="华文细黑" w:hAnsi="Calibri" w:cs="Calibri" w:hint="eastAsia"/>
+          <w:color w:val="404040" w:themeColor="text1" w:themeTint="BF"/>
+          <w:szCs w:val="21"/>
+        </w:rPr>
+        <w:t xml:space="preserve"> </w:t>
+      </w:r>
+      <w:r>
+        <w:rPr>
+          <w:rFonts w:ascii="Calibri" w:eastAsia="华文细黑" w:hAnsi="Calibri" w:cs="Calibri" w:hint="eastAsia"/>
+          <w:color w:val="404040" w:themeColor="text1" w:themeTint="BF"/>
+          <w:szCs w:val="21"/>
+        </w:rPr>
+        <w:t xml:space="preserve">       </w:t>
+      </w:r>
+      <w:r>
+        <w:rPr>
+          <w:rFonts w:ascii="Calibri" w:eastAsia="华文细黑" w:hAnsi="Calibri" w:cs="Calibri"/>
+          <w:color w:val="404040" w:themeColor="text1" w:themeTint="BF"/>
+          <w:szCs w:val="21"/>
+        </w:rPr>
+        <w:t>邮箱：</w:t>
+      </w:r>
+      <w:r>
+        <w:rPr>
+          <w:rFonts w:ascii="Calibri" w:eastAsia="华文细黑" w:hAnsi="Calibri" w:cs="Calibri"/>
+          <w:color w:val="404040" w:themeColor="text1" w:themeTint="BF"/>
+          <w:szCs w:val="21"/>
+        </w:rPr>
+        <w:t>yufei556@126.com</w:t>
+      </w:r>
+    </w:p>
+    <w:p>
+      <w:pPr>
+        <w:spacing w:line="400" w:lineRule="exact"/>
+        <w:rPr>
+          <w:rFonts w:ascii="Calibri" w:eastAsia="华文细黑" w:hAnsi="Calibri" w:cs="Calibri" w:hint="eastAsia"/>
+          <w:color w:val="404040" w:themeColor="text1" w:themeTint="BF"/>
+          <w:szCs w:val="21"/>
+        </w:rPr>
+      </w:pPr>
+      <w:r>
+        <w:rPr>
+          <w:rFonts w:ascii="Calibri" w:eastAsia="华文细黑" w:hAnsi="Calibri" w:cs="Calibri"/>
+          <w:color w:val="404040" w:themeColor="text1" w:themeTint="BF"/>
+          <w:szCs w:val="21"/>
+        </w:rPr>
+        <w:t>学</w:t>
+      </w:r>
+      <w:r>
+        <w:rPr>
+          <w:rFonts w:ascii="Calibri" w:eastAsia="华文细黑" w:hAnsi="Calibri" w:cs="Calibri"/>
+          <w:color w:val="404040" w:themeColor="text1" w:themeTint="BF"/>
+          <w:szCs w:val="21"/>
+        </w:rPr>
+        <w:t xml:space="preserve">    </w:t>
+      </w:r>
+      <w:r>
+        <w:rPr>
+          <w:rFonts w:ascii="Calibri" w:eastAsia="华文细黑" w:hAnsi="Calibri" w:cs="Calibri"/>
+          <w:color w:val="404040" w:themeColor="text1" w:themeTint="BF"/>
+          <w:szCs w:val="21"/>
+        </w:rPr>
+        <w:t>历：重庆大学</w:t>
+      </w:r>
+      <w:r>
+        <w:rPr>
+          <w:rFonts w:ascii="Calibri" w:eastAsia="华文细黑" w:hAnsi="Calibri" w:cs="Calibri"/>
+          <w:color w:val="404040" w:themeColor="text1" w:themeTint="BF"/>
+          <w:szCs w:val="21"/>
+        </w:rPr>
+        <w:t>/</w:t>
+      </w:r>
+      <w:r>
+        <w:rPr>
+          <w:rFonts w:ascii="Calibri" w:eastAsia="华文细黑" w:hAnsi="Calibri" w:cs="Calibri"/>
+          <w:color w:val="404040" w:themeColor="text1" w:themeTint="BF"/>
+          <w:szCs w:val="21"/>
+        </w:rPr>
+        <w:t>本科</w:t>
+      </w:r>
+      <w:r>
+        <w:rPr>
+          <w:rFonts w:ascii="Calibri" w:eastAsia="华文细黑" w:hAnsi="Calibri" w:cs="Calibri" w:hint="eastAsia"/>
+          <w:color w:val="404040" w:themeColor="text1" w:themeTint="BF"/>
+          <w:szCs w:val="21"/>
+        </w:rPr>
+        <w:t xml:space="preserve">  </w:t>
+      </w:r>
+      <w:r>
+        <w:rPr>
+          <w:rFonts w:ascii="Calibri" w:eastAsia="华文细黑" w:hAnsi="Calibri" w:cs="Calibri" w:hint="eastAsia"/>
+          <w:color w:val="404040" w:themeColor="text1" w:themeTint="BF"/>
+          <w:szCs w:val="21"/>
+        </w:rPr>
+        <w:t xml:space="preserve"> </w:t>
+      </w:r>
+      <w:r>
+        <w:rPr>
+          <w:rFonts w:ascii="Calibri" w:eastAsia="华文细黑" w:hAnsi="Calibri" w:cs="Calibri"/>
+          <w:color w:val="404040" w:themeColor="text1" w:themeTint="BF"/>
+          <w:szCs w:val="21"/>
+        </w:rPr>
+        <w:t>英语水平：</w:t>
+      </w:r>
+      <w:r>
+        <w:rPr>
+          <w:rFonts w:ascii="Calibri" w:eastAsia="华文细黑" w:hAnsi="Calibri" w:cs="Calibri"/>
+          <w:color w:val="404040" w:themeColor="text1" w:themeTint="BF"/>
+          <w:szCs w:val="21"/>
+        </w:rPr>
+        <w:t>CET-6</w:t>
+      </w:r>
+    </w:p>
+    <w:p>
+      <w:pPr>
+        <w:spacing w:beforeLines="50" w:before="156" w:line="400" w:lineRule="exact"/>
+        <w:rPr>
+          <w:rFonts w:ascii="华文细黑" w:eastAsia="华文细黑" w:hAnsi="华文细黑" w:cs="Calibri" w:hint="eastAsia"/>
+          <w:b/>
+          <w:bCs/>
+          <w:color w:val="404040" w:themeColor="text1" w:themeTint="BF"/>
+          <w:sz w:val="24"/>
+          <w:szCs w:val="24"/>
+        </w:rPr>
+      </w:pPr>
+      <w:r>
+        <w:rPr>
+          <w:rFonts w:ascii="华文细黑" w:eastAsia="华文细黑" w:hAnsi="华文细黑" w:cs="Calibri"/>
+          <w:b/>
+          <w:bCs/>
+          <w:color w:val="404040" w:themeColor="text1" w:themeTint="BF"/>
+          <w:sz w:val="24"/>
+          <w:szCs w:val="24"/>
+        </w:rPr>
+        <w:t>教育经历</w:t>
+      </w:r>
+    </w:p>
+    <w:p>
+      <w:pPr>
+        <w:spacing w:beforeLines="50" w:before="156" w:line="400" w:lineRule="exact"/>
+        <w:ind w:rightChars="-24" w:right="-50"/>
+        <w:rPr>
+          <w:rFonts w:ascii="Calibri" w:eastAsia="微软雅黑" w:hAnsi="Calibri" w:cs="Calibri"/>
+          <w:color w:val="404040" w:themeColor="text1" w:themeTint="BF"/>
+        </w:rPr>
+      </w:pPr>
+      <w:r>
+        <w:rPr>
           <w:rFonts w:ascii="Calibri" w:eastAsia="微软雅黑" w:hAnsi="Calibri" w:cs="Calibri"/>
           <w:b/>
           <w:bCs/>
@@ -149,18 +553,18 @@
         <mc:AlternateContent>
           <mc:Choice Requires="wps">
             <w:drawing>
-              <wp:anchor distT="0" distB="0" distL="114300" distR="114300" simplePos="0" relativeHeight="251659264" behindDoc="0" locked="0" layoutInCell="1" allowOverlap="1" wp14:anchorId="3B1B6DAB" wp14:editId="264AFB96">
+              <wp:anchor distT="0" distB="0" distL="114300" distR="114300" simplePos="0" relativeHeight="251661312" behindDoc="0" locked="0" layoutInCell="1" allowOverlap="1" wp14:anchorId="60350B24" wp14:editId="56AD4D2A">
                 <wp:simplePos x="0" y="0"/>
                 <wp:positionH relativeFrom="column">
-                  <wp:posOffset>708504</wp:posOffset>
+                  <wp:posOffset>714349</wp:posOffset>
                 </wp:positionH>
                 <wp:positionV relativeFrom="paragraph">
-                  <wp:posOffset>121860</wp:posOffset>
+                  <wp:posOffset>119380</wp:posOffset>
                 </wp:positionV>
                 <wp:extent cx="4603446" cy="0"/>
                 <wp:effectExtent l="0" t="19050" r="26035" b="19050"/>
                 <wp:wrapNone/>
-                <wp:docPr id="12" name="直接连接符 12"/>
+                <wp:docPr id="16" name="直接连接符 16"/>
                 <wp:cNvGraphicFramePr/>
                 <a:graphic xmlns:a="http://schemas.openxmlformats.org/drawingml/2006/main">
                   <a:graphicData uri="http://schemas.microsoft.com/office/word/2010/wordprocessingShape">
@@ -212,7 +616,7 @@
           </mc:Choice>
           <mc:Fallback>
             <w:pict>
-              <v:line w14:anchorId="7B4F3F79" id="直接连接符 12" o:spid="_x0000_s1026" style="position:absolute;z-index:251659264;visibility:visible;mso-wrap-style:square;mso-width-percent:0;mso-height-percent:0;mso-wrap-distance-left:9pt;mso-wrap-distance-top:0;mso-wrap-distance-right:9pt;mso-wrap-distance-bottom:0;mso-position-horizontal:absolute;mso-position-horizontal-relative:text;mso-position-vertical:absolute;mso-position-vertical-relative:text;mso-width-percent:0;mso-height-percent:0;mso-width-relative:margin;mso-height-relative:margin" from="55.8pt,9.6pt" to="418.3pt,9.6pt" o:gfxdata="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" strokecolor="gray [1629]" strokeweight="2.25pt">
+              <v:line w14:anchorId="591A0804" id="直接连接符 16" o:spid="_x0000_s1026" style="position:absolute;z-index:251661312;visibility:visible;mso-wrap-style:square;mso-width-percent:0;mso-height-percent:0;mso-wrap-distance-left:9pt;mso-wrap-distance-top:0;mso-wrap-distance-right:9pt;mso-wrap-distance-bottom:0;mso-position-horizontal:absolute;mso-position-horizontal-relative:text;mso-position-vertical:absolute;mso-position-vertical-relative:text;mso-width-percent:0;mso-height-percent:0;mso-width-relative:margin;mso-height-relative:margin" from="56.25pt,9.4pt" to="418.75pt,9.4pt" o:gfxdata="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" strokecolor="gray [1629]" strokeweight="2.25pt">
                 <v:stroke joinstyle="miter"/>
               </v:line>
             </w:pict>
@@ -221,390 +625,6 @@
       </w:r>
       <w:r>
         <w:rPr>
-          <w:rFonts w:ascii="Calibri" w:eastAsia="华文细黑" w:hAnsi="Calibri" w:cs="Calibri"/>
-          <w:color w:val="404040" w:themeColor="text1" w:themeTint="BF"/>
-          <w:szCs w:val="21"/>
-        </w:rPr>
-        <w:t>姓</w:t>
-      </w:r>
-      <w:r>
-        <w:rPr>
-          <w:rFonts w:ascii="Calibri" w:eastAsia="华文细黑" w:hAnsi="Calibri" w:cs="Calibri"/>
-          <w:color w:val="404040" w:themeColor="text1" w:themeTint="BF"/>
-          <w:szCs w:val="21"/>
-        </w:rPr>
-        <w:t xml:space="preserve">    </w:t>
-      </w:r>
-      <w:r>
-        <w:rPr>
-          <w:rFonts w:ascii="Calibri" w:eastAsia="华文细黑" w:hAnsi="Calibri" w:cs="Calibri"/>
-          <w:color w:val="404040" w:themeColor="text1" w:themeTint="BF"/>
-          <w:szCs w:val="21"/>
-        </w:rPr>
-        <w:t>名：于飞</w:t>
-      </w:r>
-      <w:r>
-        <w:rPr>
-          <w:rFonts w:ascii="Calibri" w:eastAsia="华文细黑" w:hAnsi="Calibri" w:cs="Calibri"/>
-          <w:color w:val="404040" w:themeColor="text1" w:themeTint="BF"/>
-          <w:szCs w:val="21"/>
-        </w:rPr>
-        <w:t xml:space="preserve">                         </w:t>
-      </w:r>
-      <w:r>
-        <w:rPr>
-          <w:rFonts w:ascii="Calibri" w:eastAsia="华文细黑" w:hAnsi="Calibri" w:cs="Calibri" w:hint="eastAsia"/>
-          <w:color w:val="404040" w:themeColor="text1" w:themeTint="BF"/>
-          <w:szCs w:val="21"/>
-        </w:rPr>
-        <w:t xml:space="preserve">     </w:t>
-      </w:r>
-      <w:r>
-        <w:rPr>
-          <w:rFonts w:ascii="Calibri" w:eastAsia="华文细黑" w:hAnsi="Calibri" w:cs="Calibri"/>
-          <w:color w:val="404040" w:themeColor="text1" w:themeTint="BF"/>
-          <w:szCs w:val="21"/>
-        </w:rPr>
-        <w:t xml:space="preserve">       </w:t>
-      </w:r>
-      <w:r>
-        <w:rPr>
-          <w:rFonts w:ascii="Calibri" w:eastAsia="华文细黑" w:hAnsi="Calibri" w:cs="Calibri" w:hint="eastAsia"/>
-          <w:color w:val="404040" w:themeColor="text1" w:themeTint="BF"/>
-          <w:szCs w:val="21"/>
-        </w:rPr>
-        <w:t xml:space="preserve"> </w:t>
-      </w:r>
-      <w:r>
-        <w:rPr>
-          <w:rFonts w:ascii="Calibri" w:eastAsia="华文细黑" w:hAnsi="Calibri" w:cs="Calibri"/>
-          <w:color w:val="404040" w:themeColor="text1" w:themeTint="BF"/>
-          <w:szCs w:val="21"/>
-        </w:rPr>
-        <w:t>性</w:t>
-      </w:r>
-      <w:r>
-        <w:rPr>
-          <w:rFonts w:ascii="Calibri" w:eastAsia="华文细黑" w:hAnsi="Calibri" w:cs="Calibri"/>
-          <w:color w:val="404040" w:themeColor="text1" w:themeTint="BF"/>
-          <w:szCs w:val="21"/>
-        </w:rPr>
-        <w:t xml:space="preserve">    </w:t>
-      </w:r>
-      <w:r>
-        <w:rPr>
-          <w:rFonts w:ascii="Calibri" w:eastAsia="华文细黑" w:hAnsi="Calibri" w:cs="Calibri"/>
-          <w:color w:val="404040" w:themeColor="text1" w:themeTint="BF"/>
-          <w:szCs w:val="21"/>
-        </w:rPr>
-        <w:t>别：男</w:t>
-      </w:r>
-    </w:p>
-    <w:p>
-      <w:pPr>
-        <w:spacing w:line="400" w:lineRule="exact"/>
-        <w:rPr>
-          <w:rFonts w:ascii="Calibri" w:eastAsia="华文细黑" w:hAnsi="Calibri" w:cs="Calibri"/>
-          <w:color w:val="404040" w:themeColor="text1" w:themeTint="BF"/>
-          <w:szCs w:val="21"/>
-        </w:rPr>
-      </w:pPr>
-      <w:r>
-        <w:rPr>
-          <w:rFonts w:ascii="Calibri" w:eastAsia="华文细黑" w:hAnsi="Calibri" w:cs="Calibri"/>
-          <w:color w:val="404040" w:themeColor="text1" w:themeTint="BF"/>
-          <w:szCs w:val="21"/>
-        </w:rPr>
-        <w:t>年</w:t>
-      </w:r>
-      <w:r>
-        <w:rPr>
-          <w:rFonts w:ascii="Calibri" w:eastAsia="华文细黑" w:hAnsi="Calibri" w:cs="Calibri"/>
-          <w:color w:val="404040" w:themeColor="text1" w:themeTint="BF"/>
-          <w:szCs w:val="21"/>
-        </w:rPr>
-        <w:t xml:space="preserve">    </w:t>
-      </w:r>
-      <w:r>
-        <w:rPr>
-          <w:rFonts w:ascii="Calibri" w:eastAsia="华文细黑" w:hAnsi="Calibri" w:cs="Calibri"/>
-          <w:color w:val="404040" w:themeColor="text1" w:themeTint="BF"/>
-          <w:szCs w:val="21"/>
-        </w:rPr>
-        <w:t>龄：</w:t>
-      </w:r>
-      <w:r>
-        <w:rPr>
-          <w:rFonts w:ascii="Calibri" w:eastAsia="华文细黑" w:hAnsi="Calibri" w:cs="Calibri" w:hint="eastAsia"/>
-          <w:color w:val="404040" w:themeColor="text1" w:themeTint="BF"/>
-          <w:szCs w:val="21"/>
-        </w:rPr>
-        <w:t>33</w:t>
-      </w:r>
-      <w:r>
-        <w:rPr>
-          <w:rFonts w:ascii="Calibri" w:eastAsia="华文细黑" w:hAnsi="Calibri" w:cs="Calibri"/>
-          <w:color w:val="404040" w:themeColor="text1" w:themeTint="BF"/>
-          <w:szCs w:val="21"/>
-        </w:rPr>
-        <w:t>岁</w:t>
-      </w:r>
-      <w:r>
-        <w:rPr>
-          <w:rFonts w:ascii="Calibri" w:eastAsia="华文细黑" w:hAnsi="Calibri" w:cs="Calibri"/>
-          <w:color w:val="404040" w:themeColor="text1" w:themeTint="BF"/>
-          <w:szCs w:val="21"/>
-        </w:rPr>
-        <w:t xml:space="preserve">                           </w:t>
-      </w:r>
-      <w:r>
-        <w:rPr>
-          <w:rFonts w:ascii="Calibri" w:eastAsia="华文细黑" w:hAnsi="Calibri" w:cs="Calibri" w:hint="eastAsia"/>
-          <w:color w:val="404040" w:themeColor="text1" w:themeTint="BF"/>
-          <w:szCs w:val="21"/>
-        </w:rPr>
-        <w:t xml:space="preserve">       </w:t>
-      </w:r>
-      <w:r>
-        <w:rPr>
-          <w:rFonts w:ascii="Calibri" w:eastAsia="华文细黑" w:hAnsi="Calibri" w:cs="Calibri"/>
-          <w:color w:val="404040" w:themeColor="text1" w:themeTint="BF"/>
-          <w:szCs w:val="21"/>
-        </w:rPr>
-        <w:t xml:space="preserve">   </w:t>
-      </w:r>
-      <w:r>
-        <w:rPr>
-          <w:rFonts w:ascii="Calibri" w:eastAsia="华文细黑" w:hAnsi="Calibri" w:cs="Calibri"/>
-          <w:color w:val="404040" w:themeColor="text1" w:themeTint="BF"/>
-          <w:szCs w:val="21"/>
-        </w:rPr>
-        <w:t>工作时间：</w:t>
-      </w:r>
-      <w:r>
-        <w:rPr>
-          <w:rFonts w:ascii="Calibri" w:eastAsia="华文细黑" w:hAnsi="Calibri" w:cs="Calibri" w:hint="eastAsia"/>
-          <w:color w:val="404040" w:themeColor="text1" w:themeTint="BF"/>
-          <w:szCs w:val="21"/>
-        </w:rPr>
-        <w:t>10</w:t>
-      </w:r>
-      <w:r>
-        <w:rPr>
-          <w:rFonts w:ascii="Calibri" w:eastAsia="华文细黑" w:hAnsi="Calibri" w:cs="Calibri"/>
-          <w:color w:val="404040" w:themeColor="text1" w:themeTint="BF"/>
-          <w:szCs w:val="21"/>
-        </w:rPr>
-        <w:t>年</w:t>
-      </w:r>
-    </w:p>
-    <w:p>
-      <w:pPr>
-        <w:spacing w:line="400" w:lineRule="exact"/>
-        <w:rPr>
-          <w:rFonts w:ascii="Calibri" w:eastAsia="华文细黑" w:hAnsi="Calibri" w:cs="Calibri"/>
-          <w:color w:val="404040" w:themeColor="text1" w:themeTint="BF"/>
-          <w:szCs w:val="21"/>
-        </w:rPr>
-      </w:pPr>
-      <w:r>
-        <w:rPr>
-          <w:rFonts w:ascii="Calibri" w:eastAsia="华文细黑" w:hAnsi="Calibri" w:cs="Calibri"/>
-          <w:color w:val="404040" w:themeColor="text1" w:themeTint="BF"/>
-          <w:szCs w:val="21"/>
-        </w:rPr>
-        <w:t>学</w:t>
-      </w:r>
-      <w:r>
-        <w:rPr>
-          <w:rFonts w:ascii="Calibri" w:eastAsia="华文细黑" w:hAnsi="Calibri" w:cs="Calibri"/>
-          <w:color w:val="404040" w:themeColor="text1" w:themeTint="BF"/>
-          <w:szCs w:val="21"/>
-        </w:rPr>
-        <w:t xml:space="preserve">    </w:t>
-      </w:r>
-      <w:r>
-        <w:rPr>
-          <w:rFonts w:ascii="Calibri" w:eastAsia="华文细黑" w:hAnsi="Calibri" w:cs="Calibri"/>
-          <w:color w:val="404040" w:themeColor="text1" w:themeTint="BF"/>
-          <w:szCs w:val="21"/>
-        </w:rPr>
-        <w:t>历：重庆大学</w:t>
-      </w:r>
-      <w:r>
-        <w:rPr>
-          <w:rFonts w:ascii="Calibri" w:eastAsia="华文细黑" w:hAnsi="Calibri" w:cs="Calibri"/>
-          <w:color w:val="404040" w:themeColor="text1" w:themeTint="BF"/>
-          <w:szCs w:val="21"/>
-        </w:rPr>
-        <w:t>/</w:t>
-      </w:r>
-      <w:r>
-        <w:rPr>
-          <w:rFonts w:ascii="Calibri" w:eastAsia="华文细黑" w:hAnsi="Calibri" w:cs="Calibri"/>
-          <w:color w:val="404040" w:themeColor="text1" w:themeTint="BF"/>
-          <w:szCs w:val="21"/>
-        </w:rPr>
-        <w:t>本科</w:t>
-      </w:r>
-      <w:r>
-        <w:rPr>
-          <w:rFonts w:ascii="Calibri" w:eastAsia="华文细黑" w:hAnsi="Calibri" w:cs="Calibri"/>
-          <w:color w:val="404040" w:themeColor="text1" w:themeTint="BF"/>
-          <w:szCs w:val="21"/>
-        </w:rPr>
-        <w:t xml:space="preserve">                     </w:t>
-      </w:r>
-      <w:r>
-        <w:rPr>
-          <w:rFonts w:ascii="Calibri" w:eastAsia="华文细黑" w:hAnsi="Calibri" w:cs="Calibri" w:hint="eastAsia"/>
-          <w:color w:val="404040" w:themeColor="text1" w:themeTint="BF"/>
-          <w:szCs w:val="21"/>
-        </w:rPr>
-        <w:t xml:space="preserve">      </w:t>
-      </w:r>
-      <w:r>
-        <w:rPr>
-          <w:rFonts w:ascii="Calibri" w:eastAsia="华文细黑" w:hAnsi="Calibri" w:cs="Calibri"/>
-          <w:color w:val="404040" w:themeColor="text1" w:themeTint="BF"/>
-          <w:szCs w:val="21"/>
-        </w:rPr>
-        <w:t xml:space="preserve">  </w:t>
-      </w:r>
-      <w:r>
-        <w:rPr>
-          <w:rFonts w:ascii="Calibri" w:eastAsia="华文细黑" w:hAnsi="Calibri" w:cs="Calibri"/>
-          <w:color w:val="404040" w:themeColor="text1" w:themeTint="BF"/>
-          <w:szCs w:val="21"/>
-        </w:rPr>
-        <w:t>英语水平：</w:t>
-      </w:r>
-      <w:r>
-        <w:rPr>
-          <w:rFonts w:ascii="Calibri" w:eastAsia="华文细黑" w:hAnsi="Calibri" w:cs="Calibri"/>
-          <w:color w:val="404040" w:themeColor="text1" w:themeTint="BF"/>
-          <w:szCs w:val="21"/>
-        </w:rPr>
-        <w:t>CET-6</w:t>
-      </w:r>
-    </w:p>
-    <w:p>
-      <w:pPr>
-        <w:spacing w:line="400" w:lineRule="exact"/>
-        <w:rPr>
-          <w:rFonts w:ascii="Calibri" w:eastAsia="华文细黑" w:hAnsi="Calibri" w:cs="Calibri"/>
-          <w:color w:val="404040" w:themeColor="text1" w:themeTint="BF"/>
-          <w:szCs w:val="21"/>
-        </w:rPr>
-      </w:pPr>
-      <w:r>
-        <w:rPr>
-          <w:rFonts w:ascii="Calibri" w:eastAsia="华文细黑" w:hAnsi="Calibri" w:cs="Calibri"/>
-          <w:color w:val="404040" w:themeColor="text1" w:themeTint="BF"/>
-          <w:szCs w:val="21"/>
-        </w:rPr>
-        <w:t>联系电话：</w:t>
-      </w:r>
-      <w:r>
-        <w:rPr>
-          <w:rFonts w:ascii="Calibri" w:eastAsia="华文细黑" w:hAnsi="Calibri" w:cs="Calibri"/>
-          <w:color w:val="404040" w:themeColor="text1" w:themeTint="BF"/>
-          <w:szCs w:val="21"/>
-        </w:rPr>
-        <w:t xml:space="preserve">135 7084 5834                      </w:t>
-      </w:r>
-      <w:r>
-        <w:rPr>
-          <w:rFonts w:ascii="Calibri" w:eastAsia="华文细黑" w:hAnsi="Calibri" w:cs="Calibri" w:hint="eastAsia"/>
-          <w:color w:val="404040" w:themeColor="text1" w:themeTint="BF"/>
-          <w:szCs w:val="21"/>
-        </w:rPr>
-        <w:t xml:space="preserve">      </w:t>
-      </w:r>
-      <w:r>
-        <w:rPr>
-          <w:rFonts w:ascii="Calibri" w:eastAsia="华文细黑" w:hAnsi="Calibri" w:cs="Calibri"/>
-          <w:color w:val="404040" w:themeColor="text1" w:themeTint="BF"/>
-          <w:szCs w:val="21"/>
-        </w:rPr>
-        <w:t xml:space="preserve"> </w:t>
-      </w:r>
-      <w:r>
-        <w:rPr>
-          <w:rFonts w:ascii="Calibri" w:eastAsia="华文细黑" w:hAnsi="Calibri" w:cs="Calibri"/>
-          <w:color w:val="404040" w:themeColor="text1" w:themeTint="BF"/>
-          <w:szCs w:val="21"/>
-        </w:rPr>
-        <w:t xml:space="preserve"> </w:t>
-      </w:r>
-      <w:r>
-        <w:rPr>
-          <w:rFonts w:ascii="Calibri" w:eastAsia="华文细黑" w:hAnsi="Calibri" w:cs="Calibri"/>
-          <w:color w:val="404040" w:themeColor="text1" w:themeTint="BF"/>
-          <w:szCs w:val="21"/>
-        </w:rPr>
-        <w:t>邮</w:t>
-      </w:r>
-      <w:r>
-        <w:rPr>
-          <w:rFonts w:ascii="Calibri" w:eastAsia="华文细黑" w:hAnsi="Calibri" w:cs="Calibri"/>
-          <w:color w:val="404040" w:themeColor="text1" w:themeTint="BF"/>
-          <w:szCs w:val="21"/>
-        </w:rPr>
-        <w:t xml:space="preserve">    </w:t>
-      </w:r>
-      <w:r>
-        <w:rPr>
-          <w:rFonts w:ascii="Calibri" w:eastAsia="华文细黑" w:hAnsi="Calibri" w:cs="Calibri"/>
-          <w:color w:val="404040" w:themeColor="text1" w:themeTint="BF"/>
-          <w:szCs w:val="21"/>
-        </w:rPr>
-        <w:t>箱：</w:t>
-      </w:r>
-      <w:r>
-        <w:rPr>
-          <w:rFonts w:ascii="Calibri" w:eastAsia="华文细黑" w:hAnsi="Calibri" w:cs="Calibri"/>
-          <w:color w:val="404040" w:themeColor="text1" w:themeTint="BF"/>
-          <w:szCs w:val="21"/>
-        </w:rPr>
-        <w:t>yufei556@126.com</w:t>
-      </w:r>
-    </w:p>
-    <w:p>
-      <w:pPr>
-        <w:spacing w:beforeLines="50" w:before="156" w:line="400" w:lineRule="exact"/>
-        <w:rPr>
-          <w:rFonts w:ascii="华文细黑" w:eastAsia="华文细黑" w:hAnsi="华文细黑" w:cs="Calibri" w:hint="eastAsia"/>
-          <w:b/>
-          <w:bCs/>
-          <w:color w:val="404040" w:themeColor="text1" w:themeTint="BF"/>
-          <w:sz w:val="24"/>
-          <w:szCs w:val="24"/>
-        </w:rPr>
-      </w:pPr>
-      <w:r>
-        <w:rPr>
-          <w:rFonts w:ascii="华文细黑" w:eastAsia="华文细黑" w:hAnsi="华文细黑" w:cs="Calibri"/>
-          <w:b/>
-          <w:bCs/>
-          <w:color w:val="404040" w:themeColor="text1" w:themeTint="BF"/>
-          <w:sz w:val="24"/>
-          <w:szCs w:val="24"/>
-        </w:rPr>
-        <w:t>教育经历</w:t>
-      </w:r>
-    </w:p>
-    <w:p>
-      <w:pPr>
-        <w:spacing w:beforeLines="50" w:before="156" w:line="400" w:lineRule="exact"/>
-        <w:ind w:rightChars="-24" w:right="-50"/>
-        <w:rPr>
-          <w:rFonts w:ascii="Calibri" w:eastAsia="微软雅黑" w:hAnsi="Calibri" w:cs="Calibri"/>
-          <w:color w:val="404040" w:themeColor="text1" w:themeTint="BF"/>
-        </w:rPr>
-      </w:pPr>
-      <w:r>
-        <w:rPr>
           <w:rFonts w:ascii="Calibri" w:eastAsia="微软雅黑" w:hAnsi="Calibri" w:cs="Calibri"/>
           <w:b/>
           <w:bCs/>
@@ -616,7 +636,7 @@
         <mc:AlternateContent>
           <mc:Choice Requires="wps">
             <w:drawing>
-              <wp:anchor distT="0" distB="0" distL="114300" distR="114300" simplePos="0" relativeHeight="251662336" behindDoc="0" locked="0" layoutInCell="1" allowOverlap="1" wp14:anchorId="25A26164" wp14:editId="617F0022">
+              <wp:anchor distT="0" distB="0" distL="114300" distR="114300" simplePos="0" relativeHeight="251662336" behindDoc="0" locked="0" layoutInCell="1" allowOverlap="1" wp14:anchorId="25A26164" wp14:editId="1895706D">
                 <wp:simplePos x="0" y="0"/>
                 <wp:positionH relativeFrom="column">
                   <wp:posOffset>584</wp:posOffset>
@@ -676,7 +696,7 @@
           </mc:Choice>
           <mc:Fallback>
             <w:pict>
-              <v:line w14:anchorId="0575191C" id="直接连接符 15" o:spid="_x0000_s1026" style="position:absolute;z-index:251662336;visibility:visible;mso-wrap-style:square;mso-width-percent:0;mso-height-percent:0;mso-wrap-distance-left:9pt;mso-wrap-distance-top:0;mso-wrap-distance-right:9pt;mso-wrap-distance-bottom:0;mso-position-horizontal:absolute;mso-position-horizontal-relative:text;mso-position-vertical:absolute;mso-position-vertical-relative:text;mso-width-percent:0;mso-height-percent:0;mso-width-relative:margin;mso-height-relative:margin" from=".05pt,9.5pt" to="55.7pt,9.5pt" o:gfxdata="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" strokecolor="#53aba1" strokeweight="2.25pt">
+              <v:line w14:anchorId="0B907BB5" id="直接连接符 15" o:spid="_x0000_s1026" style="position:absolute;z-index:251662336;visibility:visible;mso-wrap-style:square;mso-width-percent:0;mso-height-percent:0;mso-wrap-distance-left:9pt;mso-wrap-distance-top:0;mso-wrap-distance-right:9pt;mso-wrap-distance-bottom:0;mso-position-horizontal:absolute;mso-position-horizontal-relative:text;mso-position-vertical:absolute;mso-position-vertical-relative:text;mso-width-percent:0;mso-height-percent:0;mso-width-relative:margin;mso-height-relative:margin" from=".05pt,9.5pt" to="55.7pt,9.5pt" o:gfxdata="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" strokecolor="#53aba1" strokeweight="2.25pt">
                 <v:stroke joinstyle="miter"/>
               </v:line>
             </w:pict>
@@ -686,349 +706,170 @@
       <w:r>
         <w:rPr>
           <w:rFonts w:ascii="Calibri" w:eastAsia="微软雅黑" w:hAnsi="Calibri" w:cs="Calibri"/>
-          <w:b/>
-          <w:bCs/>
+          <w:color w:val="404040" w:themeColor="text1" w:themeTint="BF"/>
+          <w:szCs w:val="21"/>
+        </w:rPr>
+        <w:t xml:space="preserve">2012-09 </w:t>
+      </w:r>
+      <w:r>
+        <w:rPr>
+          <w:rFonts w:ascii="华文细黑" w:eastAsia="华文细黑" w:hAnsi="华文细黑" w:cs="Calibri"/>
+          <w:color w:val="404040" w:themeColor="text1" w:themeTint="BF"/>
+          <w:szCs w:val="21"/>
+        </w:rPr>
+        <w:t>至</w:t>
+      </w:r>
+      <w:r>
+        <w:rPr>
+          <w:rFonts w:ascii="Calibri" w:eastAsia="微软雅黑" w:hAnsi="Calibri" w:cs="Calibri"/>
+          <w:color w:val="404040" w:themeColor="text1" w:themeTint="BF"/>
+          <w:szCs w:val="21"/>
+        </w:rPr>
+        <w:t xml:space="preserve"> 2016-06      </w:t>
+      </w:r>
+      <w:r>
+        <w:rPr>
+          <w:rFonts w:ascii="Calibri" w:eastAsia="微软雅黑" w:hAnsi="Calibri" w:cs="Calibri" w:hint="eastAsia"/>
+          <w:color w:val="404040" w:themeColor="text1" w:themeTint="BF"/>
+          <w:szCs w:val="21"/>
+        </w:rPr>
+        <w:t xml:space="preserve">  </w:t>
+      </w:r>
+      <w:r>
+        <w:rPr>
+          <w:rFonts w:ascii="Calibri" w:eastAsia="微软雅黑" w:hAnsi="Calibri" w:cs="Calibri"/>
+          <w:color w:val="404040" w:themeColor="text1" w:themeTint="BF"/>
+          <w:szCs w:val="21"/>
+        </w:rPr>
+        <w:t xml:space="preserve">        </w:t>
+      </w:r>
+      <w:r>
+        <w:rPr>
+          <w:rFonts w:ascii="华文细黑" w:eastAsia="华文细黑" w:hAnsi="华文细黑" w:cs="Calibri"/>
+          <w:color w:val="404040" w:themeColor="text1" w:themeTint="BF"/>
+          <w:szCs w:val="21"/>
+        </w:rPr>
+        <w:t>重庆大学</w:t>
+      </w:r>
+      <w:r>
+        <w:rPr>
+          <w:rFonts w:ascii="华文细黑" w:eastAsia="华文细黑" w:hAnsi="华文细黑" w:cs="Calibri" w:hint="eastAsia"/>
+          <w:color w:val="404040" w:themeColor="text1" w:themeTint="BF"/>
+          <w:szCs w:val="21"/>
+        </w:rPr>
+        <w:t xml:space="preserve"> </w:t>
+      </w:r>
+      <w:r>
+        <w:rPr>
+          <w:rFonts w:ascii="华文细黑" w:eastAsia="华文细黑" w:hAnsi="华文细黑" w:cs="Calibri"/>
+          <w:color w:val="404040" w:themeColor="text1" w:themeTint="BF"/>
+          <w:szCs w:val="21"/>
+        </w:rPr>
+        <w:t xml:space="preserve">         </w:t>
+      </w:r>
+      <w:r>
+        <w:rPr>
+          <w:rFonts w:ascii="华文细黑" w:eastAsia="华文细黑" w:hAnsi="华文细黑" w:cs="Calibri"/>
+          <w:color w:val="404040" w:themeColor="text1" w:themeTint="BF"/>
+          <w:szCs w:val="21"/>
+        </w:rPr>
+        <w:t xml:space="preserve">     </w:t>
+      </w:r>
+      <w:r>
+        <w:rPr>
+          <w:rFonts w:ascii="华文细黑" w:eastAsia="华文细黑" w:hAnsi="华文细黑" w:cs="Calibri"/>
+          <w:color w:val="404040" w:themeColor="text1" w:themeTint="BF"/>
+          <w:szCs w:val="21"/>
+        </w:rPr>
+        <w:t>本科</w:t>
+      </w:r>
+      <w:r>
+        <w:rPr>
+          <w:rFonts w:ascii="华文细黑" w:eastAsia="华文细黑" w:hAnsi="华文细黑" w:cs="Calibri" w:hint="eastAsia"/>
+          <w:color w:val="404040" w:themeColor="text1" w:themeTint="BF"/>
+          <w:szCs w:val="21"/>
+        </w:rPr>
+        <w:t>/</w:t>
+      </w:r>
+      <w:r>
+        <w:rPr>
+          <w:rFonts w:ascii="华文细黑" w:eastAsia="华文细黑" w:hAnsi="华文细黑" w:cs="Calibri"/>
+          <w:color w:val="404040" w:themeColor="text1" w:themeTint="BF"/>
+          <w:szCs w:val="21"/>
+        </w:rPr>
+        <w:t>通信工程</w:t>
+      </w:r>
+      <w:r>
+        <w:rPr>
+          <w:rFonts w:ascii="华文细黑" w:eastAsia="华文细黑" w:hAnsi="华文细黑" w:cs="Calibri" w:hint="eastAsia"/>
+          <w:color w:val="404040" w:themeColor="text1" w:themeTint="BF"/>
+          <w:szCs w:val="21"/>
+        </w:rPr>
+        <w:t>（985院校）</w:t>
+      </w:r>
+    </w:p>
+    <w:p>
+      <w:pPr>
+        <w:spacing w:beforeLines="50" w:before="156" w:line="400" w:lineRule="exact"/>
+        <w:rPr>
+          <w:rFonts w:ascii="Calibri" w:eastAsia="华文细黑" w:hAnsi="Calibri" w:cs="Calibri" w:hint="eastAsia"/>
+          <w:color w:val="404040" w:themeColor="text1" w:themeTint="BF"/>
+          <w:szCs w:val="21"/>
+        </w:rPr>
+      </w:pPr>
+      <w:r>
+        <w:rPr>
+          <w:rFonts w:ascii="华文细黑" w:eastAsia="华文细黑" w:hAnsi="华文细黑" w:cs="Calibri"/>
+          <w:b/>
+          <w:bCs/>
+          <w:color w:val="404040" w:themeColor="text1" w:themeTint="BF"/>
+          <w:sz w:val="24"/>
+          <w:szCs w:val="24"/>
+        </w:rPr>
+        <w:t>专业</w:t>
+      </w:r>
+      <w:r>
+        <w:rPr>
+          <w:rFonts w:ascii="华文细黑" w:eastAsia="华文细黑" w:hAnsi="华文细黑" w:cs="Calibri" w:hint="eastAsia"/>
+          <w:b/>
+          <w:bCs/>
+          <w:color w:val="404040" w:themeColor="text1" w:themeTint="BF"/>
+          <w:sz w:val="24"/>
+          <w:szCs w:val="24"/>
+        </w:rPr>
+        <w:t>能力</w:t>
+      </w:r>
+    </w:p>
+    <w:p>
+      <w:pPr>
+        <w:pStyle w:val="a3"/>
+        <w:numPr>
+          <w:ilvl w:val="0"/>
+          <w:numId w:val="36"/>
+        </w:numPr>
+        <w:spacing w:beforeLines="50" w:before="156" w:line="300" w:lineRule="exact"/>
+        <w:ind w:left="442" w:firstLineChars="0" w:hanging="442"/>
+        <w:rPr>
+          <w:rFonts w:ascii="Calibri" w:eastAsia="华文细黑" w:hAnsi="Calibri" w:cs="Calibri"/>
+          <w:color w:val="404040" w:themeColor="text1" w:themeTint="BF"/>
+          <w:szCs w:val="21"/>
+        </w:rPr>
+      </w:pPr>
+      <w:r>
+        <w:rPr>
           <w:noProof/>
-          <w:sz w:val="36"/>
-          <w:szCs w:val="36"/>
           <w:lang w:val="zh-CN"/>
         </w:rPr>
         <mc:AlternateContent>
           <mc:Choice Requires="wps">
             <w:drawing>
-              <wp:anchor distT="0" distB="0" distL="114300" distR="114300" simplePos="0" relativeHeight="251661312" behindDoc="0" locked="0" layoutInCell="1" allowOverlap="1" wp14:anchorId="60350B24" wp14:editId="6DF94868">
+              <wp:anchor distT="0" distB="0" distL="114300" distR="114300" simplePos="0" relativeHeight="251663360" behindDoc="0" locked="0" layoutInCell="1" allowOverlap="1" wp14:anchorId="0EDDA552" wp14:editId="3BACB3E9">
                 <wp:simplePos x="0" y="0"/>
                 <wp:positionH relativeFrom="column">
-                  <wp:posOffset>708504</wp:posOffset>
+                  <wp:posOffset>714723</wp:posOffset>
                 </wp:positionH>
                 <wp:positionV relativeFrom="paragraph">
-                  <wp:posOffset>121860</wp:posOffset>
-                </wp:positionV>
-                <wp:extent cx="4603446" cy="0"/>
-                <wp:effectExtent l="0" t="19050" r="26035" b="19050"/>
-                <wp:wrapNone/>
-                <wp:docPr id="16" name="直接连接符 16"/>
-                <wp:cNvGraphicFramePr/>
-                <a:graphic xmlns:a="http://schemas.openxmlformats.org/drawingml/2006/main">
-                  <a:graphicData uri="http://schemas.microsoft.com/office/word/2010/wordprocessingShape">
-                    <wps:wsp>
-                      <wps:cNvCnPr/>
-                      <wps:spPr>
-                        <a:xfrm>
-                          <a:off x="0" y="0"/>
-                          <a:ext cx="4603446" cy="0"/>
-                        </a:xfrm>
-                        <a:prstGeom prst="line">
-                          <a:avLst/>
-                        </a:prstGeom>
-                        <a:ln w="28575">
-                          <a:solidFill>
-                            <a:schemeClr val="tx1">
-                              <a:lumMod val="50000"/>
-                              <a:lumOff val="50000"/>
-                            </a:schemeClr>
-                          </a:solidFill>
-                        </a:ln>
-                      </wps:spPr>
-                      <wps:style>
-                        <a:lnRef idx="1">
-                          <a:schemeClr val="accent1"/>
-                        </a:lnRef>
-                        <a:fillRef idx="0">
-                          <a:schemeClr val="accent1"/>
-                        </a:fillRef>
-                        <a:effectRef idx="0">
-                          <a:schemeClr val="accent1"/>
-                        </a:effectRef>
-                        <a:fontRef idx="minor">
-                          <a:schemeClr val="tx1"/>
-                        </a:fontRef>
-                      </wps:style>
-                      <wps:bodyPr/>
-                    </wps:wsp>
-                  </a:graphicData>
-                </a:graphic>
-                <wp14:sizeRelH relativeFrom="margin">
-                  <wp14:pctWidth>0</wp14:pctWidth>
-                </wp14:sizeRelH>
-                <wp14:sizeRelV relativeFrom="margin">
-                  <wp14:pctHeight>0</wp14:pctHeight>
-                </wp14:sizeRelV>
-              </wp:anchor>
-            </w:drawing>
-          </mc:Choice>
-          <mc:Fallback>
-            <w:pict>
-              <v:line w14:anchorId="1B20A9E9" id="直接连接符 16" o:spid="_x0000_s1026" style="position:absolute;z-index:251661312;visibility:visible;mso-wrap-style:square;mso-width-percent:0;mso-height-percent:0;mso-wrap-distance-left:9pt;mso-wrap-distance-top:0;mso-wrap-distance-right:9pt;mso-wrap-distance-bottom:0;mso-position-horizontal:absolute;mso-position-horizontal-relative:text;mso-position-vertical:absolute;mso-position-vertical-relative:text;mso-width-percent:0;mso-height-percent:0;mso-width-relative:margin;mso-height-relative:margin" from="55.8pt,9.6pt" to="418.3pt,9.6pt" o:gfxdata="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" strokecolor="gray [1629]" strokeweight="2.25pt">
-                <v:stroke joinstyle="miter"/>
-              </v:line>
-            </w:pict>
-          </mc:Fallback>
-        </mc:AlternateContent>
-      </w:r>
-      <w:r>
-        <w:rPr>
-          <w:rFonts w:ascii="Calibri" w:eastAsia="微软雅黑" w:hAnsi="Calibri" w:cs="Calibri"/>
-          <w:color w:val="404040" w:themeColor="text1" w:themeTint="BF"/>
-          <w:szCs w:val="21"/>
-        </w:rPr>
-        <w:t xml:space="preserve">2012-09 </w:t>
-      </w:r>
-      <w:r>
-        <w:rPr>
-          <w:rFonts w:ascii="华文细黑" w:eastAsia="华文细黑" w:hAnsi="华文细黑" w:cs="Calibri"/>
-          <w:color w:val="404040" w:themeColor="text1" w:themeTint="BF"/>
-          <w:szCs w:val="21"/>
-        </w:rPr>
-        <w:t>至</w:t>
-      </w:r>
-      <w:r>
-        <w:rPr>
-          <w:rFonts w:ascii="Calibri" w:eastAsia="微软雅黑" w:hAnsi="Calibri" w:cs="Calibri"/>
-          <w:color w:val="404040" w:themeColor="text1" w:themeTint="BF"/>
-          <w:szCs w:val="21"/>
-        </w:rPr>
-        <w:t xml:space="preserve"> 2016-06      </w:t>
-      </w:r>
-      <w:r>
-        <w:rPr>
-          <w:rFonts w:ascii="Calibri" w:eastAsia="微软雅黑" w:hAnsi="Calibri" w:cs="Calibri" w:hint="eastAsia"/>
-          <w:color w:val="404040" w:themeColor="text1" w:themeTint="BF"/>
-          <w:szCs w:val="21"/>
-        </w:rPr>
-        <w:t xml:space="preserve">  </w:t>
-      </w:r>
-      <w:r>
-        <w:rPr>
-          <w:rFonts w:ascii="Calibri" w:eastAsia="微软雅黑" w:hAnsi="Calibri" w:cs="Calibri"/>
-          <w:color w:val="404040" w:themeColor="text1" w:themeTint="BF"/>
-          <w:szCs w:val="21"/>
-        </w:rPr>
-        <w:t xml:space="preserve">        </w:t>
-      </w:r>
-      <w:r>
-        <w:rPr>
-          <w:rFonts w:ascii="华文细黑" w:eastAsia="华文细黑" w:hAnsi="华文细黑" w:cs="Calibri"/>
-          <w:color w:val="404040" w:themeColor="text1" w:themeTint="BF"/>
-          <w:szCs w:val="21"/>
-        </w:rPr>
-        <w:t>重庆大学</w:t>
-      </w:r>
-      <w:r>
-        <w:rPr>
-          <w:rFonts w:ascii="华文细黑" w:eastAsia="华文细黑" w:hAnsi="华文细黑" w:cs="Calibri" w:hint="eastAsia"/>
-          <w:color w:val="404040" w:themeColor="text1" w:themeTint="BF"/>
-          <w:szCs w:val="21"/>
-        </w:rPr>
-        <w:t xml:space="preserve"> </w:t>
-      </w:r>
-      <w:r>
-        <w:rPr>
-          <w:rFonts w:ascii="华文细黑" w:eastAsia="华文细黑" w:hAnsi="华文细黑" w:cs="Calibri"/>
-          <w:color w:val="404040" w:themeColor="text1" w:themeTint="BF"/>
-          <w:szCs w:val="21"/>
-        </w:rPr>
-        <w:t xml:space="preserve">         </w:t>
-      </w:r>
-      <w:r>
-        <w:rPr>
-          <w:rFonts w:ascii="华文细黑" w:eastAsia="华文细黑" w:hAnsi="华文细黑" w:cs="Calibri"/>
-          <w:color w:val="404040" w:themeColor="text1" w:themeTint="BF"/>
-          <w:szCs w:val="21"/>
-        </w:rPr>
-        <w:t xml:space="preserve">     </w:t>
-      </w:r>
-      <w:r>
-        <w:rPr>
-          <w:rFonts w:ascii="华文细黑" w:eastAsia="华文细黑" w:hAnsi="华文细黑" w:cs="Calibri"/>
-          <w:color w:val="404040" w:themeColor="text1" w:themeTint="BF"/>
-          <w:szCs w:val="21"/>
-        </w:rPr>
-        <w:t>本科</w:t>
-      </w:r>
-      <w:r>
-        <w:rPr>
-          <w:rFonts w:ascii="华文细黑" w:eastAsia="华文细黑" w:hAnsi="华文细黑" w:cs="Calibri" w:hint="eastAsia"/>
-          <w:color w:val="404040" w:themeColor="text1" w:themeTint="BF"/>
-          <w:szCs w:val="21"/>
-        </w:rPr>
-        <w:t>/</w:t>
-      </w:r>
-      <w:r>
-        <w:rPr>
-          <w:rFonts w:ascii="华文细黑" w:eastAsia="华文细黑" w:hAnsi="华文细黑" w:cs="Calibri"/>
-          <w:color w:val="404040" w:themeColor="text1" w:themeTint="BF"/>
-          <w:szCs w:val="21"/>
-        </w:rPr>
-        <w:t>通信工程</w:t>
-      </w:r>
-      <w:r>
-        <w:rPr>
-          <w:rFonts w:ascii="华文细黑" w:eastAsia="华文细黑" w:hAnsi="华文细黑" w:cs="Calibri" w:hint="eastAsia"/>
-          <w:color w:val="404040" w:themeColor="text1" w:themeTint="BF"/>
-          <w:szCs w:val="21"/>
-        </w:rPr>
-        <w:t>（985院校）</w:t>
-      </w:r>
-    </w:p>
-    <w:p>
-      <w:pPr>
-        <w:spacing w:beforeLines="50" w:before="156" w:line="400" w:lineRule="exact"/>
-        <w:rPr>
-          <w:rFonts w:ascii="华文细黑" w:eastAsia="华文细黑" w:hAnsi="华文细黑" w:cs="Calibri" w:hint="eastAsia"/>
-          <w:b/>
-          <w:bCs/>
-          <w:color w:val="404040" w:themeColor="text1" w:themeTint="BF"/>
-          <w:sz w:val="24"/>
-          <w:szCs w:val="24"/>
-        </w:rPr>
-      </w:pPr>
-      <w:r>
-        <w:rPr>
-          <w:rFonts w:ascii="华文细黑" w:eastAsia="华文细黑" w:hAnsi="华文细黑" w:cs="Calibri"/>
-          <w:b/>
-          <w:bCs/>
-          <w:color w:val="404040" w:themeColor="text1" w:themeTint="BF"/>
-          <w:sz w:val="24"/>
-          <w:szCs w:val="24"/>
-        </w:rPr>
-        <w:t>专业</w:t>
-      </w:r>
-      <w:r>
-        <w:rPr>
-          <w:rFonts w:ascii="华文细黑" w:eastAsia="华文细黑" w:hAnsi="华文细黑" w:cs="Calibri" w:hint="eastAsia"/>
-          <w:b/>
-          <w:bCs/>
-          <w:color w:val="404040" w:themeColor="text1" w:themeTint="BF"/>
-          <w:sz w:val="24"/>
-          <w:szCs w:val="24"/>
-        </w:rPr>
-        <w:t>能力</w:t>
-      </w:r>
-    </w:p>
-    <w:p>
-      <w:pPr>
-        <w:pStyle w:val="a3"/>
-        <w:numPr>
-          <w:ilvl w:val="0"/>
-          <w:numId w:val="10"/>
-        </w:numPr>
-        <w:spacing w:beforeLines="50" w:before="156" w:line="400" w:lineRule="exact"/>
-        <w:ind w:left="357" w:firstLineChars="0" w:hanging="357"/>
-        <w:rPr>
-          <w:rFonts w:ascii="Calibri" w:eastAsia="华文细黑" w:hAnsi="Calibri" w:cs="Calibri"/>
-          <w:color w:val="404040" w:themeColor="text1" w:themeTint="BF"/>
-          <w:szCs w:val="21"/>
-        </w:rPr>
-      </w:pPr>
-      <w:r>
-        <w:rPr>
-          <w:rFonts w:ascii="Calibri" w:eastAsia="华文细黑" w:hAnsi="Calibri" w:cs="Calibri" w:hint="eastAsia"/>
-          <w:color w:val="404040" w:themeColor="text1" w:themeTint="BF"/>
-          <w:szCs w:val="21"/>
-        </w:rPr>
-        <w:t>精通</w:t>
-      </w:r>
-      <w:r>
-        <w:rPr>
-          <w:rFonts w:eastAsia="微软雅黑"/>
-          <w:b/>
-          <w:bCs/>
-          <w:noProof/>
-          <w:sz w:val="36"/>
-          <w:szCs w:val="36"/>
-          <w:lang w:val="zh-CN"/>
-        </w:rPr>
-        <mc:AlternateContent>
-          <mc:Choice Requires="wps">
-            <w:drawing>
-              <wp:anchor distT="0" distB="0" distL="114300" distR="114300" simplePos="0" relativeHeight="251664384" behindDoc="0" locked="0" layoutInCell="1" allowOverlap="1" wp14:anchorId="0F5B9FF1" wp14:editId="4913923A">
-                <wp:simplePos x="0" y="0"/>
-                <wp:positionH relativeFrom="column">
-                  <wp:posOffset>584</wp:posOffset>
-                </wp:positionH>
-                <wp:positionV relativeFrom="paragraph">
-                  <wp:posOffset>120863</wp:posOffset>
-                </wp:positionV>
-                <wp:extent cx="706494" cy="0"/>
-                <wp:effectExtent l="0" t="19050" r="36830" b="19050"/>
-                <wp:wrapNone/>
-                <wp:docPr id="18" name="直接连接符 18"/>
-                <wp:cNvGraphicFramePr/>
-                <a:graphic xmlns:a="http://schemas.openxmlformats.org/drawingml/2006/main">
-                  <a:graphicData uri="http://schemas.microsoft.com/office/word/2010/wordprocessingShape">
-                    <wps:wsp>
-                      <wps:cNvCnPr/>
-                      <wps:spPr>
-                        <a:xfrm>
-                          <a:off x="0" y="0"/>
-                          <a:ext cx="706494" cy="0"/>
-                        </a:xfrm>
-                        <a:prstGeom prst="line">
-                          <a:avLst/>
-                        </a:prstGeom>
-                        <a:ln w="28575">
-                          <a:solidFill>
-                            <a:srgbClr val="53ABA1"/>
-                          </a:solidFill>
-                        </a:ln>
-                      </wps:spPr>
-                      <wps:style>
-                        <a:lnRef idx="1">
-                          <a:schemeClr val="accent1"/>
-                        </a:lnRef>
-                        <a:fillRef idx="0">
-                          <a:schemeClr val="accent1"/>
-                        </a:fillRef>
-                        <a:effectRef idx="0">
-                          <a:schemeClr val="accent1"/>
-                        </a:effectRef>
-                        <a:fontRef idx="minor">
-                          <a:schemeClr val="tx1"/>
-                        </a:fontRef>
-                      </wps:style>
-                      <wps:bodyPr/>
-                    </wps:wsp>
-                  </a:graphicData>
-                </a:graphic>
-                <wp14:sizeRelH relativeFrom="margin">
-                  <wp14:pctWidth>0</wp14:pctWidth>
-                </wp14:sizeRelH>
-                <wp14:sizeRelV relativeFrom="margin">
-                  <wp14:pctHeight>0</wp14:pctHeight>
-                </wp14:sizeRelV>
-              </wp:anchor>
-            </w:drawing>
-          </mc:Choice>
-          <mc:Fallback>
-            <w:pict>
-              <v:line w14:anchorId="5697BB46" id="直接连接符 18" o:spid="_x0000_s1026" style="position:absolute;z-index:251664384;visibility:visible;mso-wrap-style:square;mso-width-percent:0;mso-height-percent:0;mso-wrap-distance-left:9pt;mso-wrap-distance-top:0;mso-wrap-distance-right:9pt;mso-wrap-distance-bottom:0;mso-position-horizontal:absolute;mso-position-horizontal-relative:text;mso-position-vertical:absolute;mso-position-vertical-relative:text;mso-width-percent:0;mso-height-percent:0;mso-width-relative:margin;mso-height-relative:margin" from=".05pt,9.5pt" to="55.7pt,9.5pt" o:gfxdata="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" strokecolor="#53aba1" strokeweight="2.25pt">
-                <v:stroke joinstyle="miter"/>
-              </v:line>
-            </w:pict>
-          </mc:Fallback>
-        </mc:AlternateContent>
-      </w:r>
-      <w:r>
-        <w:rPr>
-          <w:rFonts w:eastAsia="微软雅黑"/>
-          <w:b/>
-          <w:bCs/>
-          <w:noProof/>
-          <w:sz w:val="36"/>
-          <w:szCs w:val="36"/>
-          <w:lang w:val="zh-CN"/>
-        </w:rPr>
-        <mc:AlternateContent>
-          <mc:Choice Requires="wps">
-            <w:drawing>
-              <wp:anchor distT="0" distB="0" distL="114300" distR="114300" simplePos="0" relativeHeight="251663360" behindDoc="0" locked="0" layoutInCell="1" allowOverlap="1" wp14:anchorId="0EDDA552" wp14:editId="681C03FE">
-                <wp:simplePos x="0" y="0"/>
-                <wp:positionH relativeFrom="column">
-                  <wp:posOffset>708504</wp:posOffset>
-                </wp:positionH>
-                <wp:positionV relativeFrom="paragraph">
-                  <wp:posOffset>121860</wp:posOffset>
+                  <wp:posOffset>45085</wp:posOffset>
                 </wp:positionV>
                 <wp:extent cx="4603446" cy="0"/>
                 <wp:effectExtent l="0" t="19050" r="26035" b="19050"/>
@@ -1085,7 +926,7 @@
           </mc:Choice>
           <mc:Fallback>
             <w:pict>
-              <v:line w14:anchorId="4CF8D941" id="直接连接符 19" o:spid="_x0000_s1026" style="position:absolute;z-index:251663360;visibility:visible;mso-wrap-style:square;mso-width-percent:0;mso-height-percent:0;mso-wrap-distance-left:9pt;mso-wrap-distance-top:0;mso-wrap-distance-right:9pt;mso-wrap-distance-bottom:0;mso-position-horizontal:absolute;mso-position-horizontal-relative:text;mso-position-vertical:absolute;mso-position-vertical-relative:text;mso-width-percent:0;mso-height-percent:0;mso-width-relative:margin;mso-height-relative:margin" from="55.8pt,9.6pt" to="418.3pt,9.6pt" o:gfxdata="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" strokecolor="gray [1629]" strokeweight="2.25pt">
+              <v:line w14:anchorId="5BBC39CC" id="直接连接符 19" o:spid="_x0000_s1026" style="position:absolute;z-index:251663360;visibility:visible;mso-wrap-style:square;mso-width-percent:0;mso-height-percent:0;mso-wrap-distance-left:9pt;mso-wrap-distance-top:0;mso-wrap-distance-right:9pt;mso-wrap-distance-bottom:0;mso-position-horizontal:absolute;mso-position-horizontal-relative:text;mso-position-vertical:absolute;mso-position-vertical-relative:text;mso-width-percent:0;mso-height-percent:0;mso-width-relative:margin;mso-height-relative:margin" from="56.3pt,3.55pt" to="418.8pt,3.55pt" o:gfxdata="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" strokecolor="gray [1629]" strokeweight="2.25pt">
                 <v:stroke joinstyle="miter"/>
               </v:line>
             </w:pict>
@@ -1094,6 +935,100 @@
       </w:r>
       <w:r>
         <w:rPr>
+          <w:noProof/>
+          <w:lang w:val="zh-CN"/>
+        </w:rPr>
+        <mc:AlternateContent>
+          <mc:Choice Requires="wps">
+            <w:drawing>
+              <wp:anchor distT="0" distB="0" distL="114300" distR="114300" simplePos="0" relativeHeight="251664384" behindDoc="0" locked="0" layoutInCell="1" allowOverlap="1" wp14:anchorId="0F5B9FF1" wp14:editId="5E8A330E">
+                <wp:simplePos x="0" y="0"/>
+                <wp:positionH relativeFrom="margin">
+                  <wp:align>left</wp:align>
+                </wp:positionH>
+                <wp:positionV relativeFrom="paragraph">
+                  <wp:posOffset>43815</wp:posOffset>
+                </wp:positionV>
+                <wp:extent cx="706120" cy="0"/>
+                <wp:effectExtent l="0" t="19050" r="36830" b="19050"/>
+                <wp:wrapNone/>
+                <wp:docPr id="18" name="直接连接符 18"/>
+                <wp:cNvGraphicFramePr/>
+                <a:graphic xmlns:a="http://schemas.openxmlformats.org/drawingml/2006/main">
+                  <a:graphicData uri="http://schemas.microsoft.com/office/word/2010/wordprocessingShape">
+                    <wps:wsp>
+                      <wps:cNvCnPr/>
+                      <wps:spPr>
+                        <a:xfrm>
+                          <a:off x="0" y="0"/>
+                          <a:ext cx="706120" cy="0"/>
+                        </a:xfrm>
+                        <a:prstGeom prst="line">
+                          <a:avLst/>
+                        </a:prstGeom>
+                        <a:ln w="28575">
+                          <a:solidFill>
+                            <a:srgbClr val="53ABA1"/>
+                          </a:solidFill>
+                        </a:ln>
+                      </wps:spPr>
+                      <wps:style>
+                        <a:lnRef idx="1">
+                          <a:schemeClr val="accent1"/>
+                        </a:lnRef>
+                        <a:fillRef idx="0">
+                          <a:schemeClr val="accent1"/>
+                        </a:fillRef>
+                        <a:effectRef idx="0">
+                          <a:schemeClr val="accent1"/>
+                        </a:effectRef>
+                        <a:fontRef idx="minor">
+                          <a:schemeClr val="tx1"/>
+                        </a:fontRef>
+                      </wps:style>
+                      <wps:bodyPr/>
+                    </wps:wsp>
+                  </a:graphicData>
+                </a:graphic>
+                <wp14:sizeRelH relativeFrom="margin">
+                  <wp14:pctWidth>0</wp14:pctWidth>
+                </wp14:sizeRelH>
+                <wp14:sizeRelV relativeFrom="margin">
+                  <wp14:pctHeight>0</wp14:pctHeight>
+                </wp14:sizeRelV>
+              </wp:anchor>
+            </w:drawing>
+          </mc:Choice>
+          <mc:Fallback>
+            <w:pict>
+              <v:line w14:anchorId="781BE8F6" id="直接连接符 18" o:spid="_x0000_s1026" style="position:absolute;z-index:251664384;visibility:visible;mso-wrap-style:square;mso-width-percent:0;mso-height-percent:0;mso-wrap-distance-left:9pt;mso-wrap-distance-top:0;mso-wrap-distance-right:9pt;mso-wrap-distance-bottom:0;mso-position-horizontal:left;mso-position-horizontal-relative:margin;mso-position-vertical:absolute;mso-position-vertical-relative:text;mso-width-percent:0;mso-height-percent:0;mso-width-relative:margin;mso-height-relative:margin" from="0,3.45pt" to="55.6pt,3.45pt" o:gfxdata="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" strokecolor="#53aba1" strokeweight="2.25pt">
+                <v:stroke joinstyle="miter"/>
+                <w10:wrap anchorx="margin"/>
+              </v:line>
+            </w:pict>
+          </mc:Fallback>
+        </mc:AlternateContent>
+      </w:r>
+      <w:r>
+        <w:rPr>
+          <w:rFonts w:ascii="Calibri" w:eastAsia="华文细黑" w:hAnsi="Calibri" w:cs="Calibri"/>
+          <w:b/>
+          <w:bCs/>
+          <w:color w:val="404040" w:themeColor="text1" w:themeTint="BF"/>
+          <w:szCs w:val="21"/>
+        </w:rPr>
+        <w:t>技术能力：</w:t>
+      </w:r>
+      <w:r>
+        <w:rPr>
+          <w:rFonts w:ascii="Calibri" w:eastAsia="华文细黑" w:hAnsi="Calibri" w:cs="Calibri"/>
+          <w:color w:val="404040" w:themeColor="text1" w:themeTint="BF"/>
+          <w:szCs w:val="21"/>
+        </w:rPr>
+        <w:t>精通</w:t>
+      </w:r>
+      <w:r>
+        <w:rPr>
           <w:rFonts w:ascii="Calibri" w:eastAsia="华文细黑" w:hAnsi="Calibri" w:cs="Calibri"/>
           <w:color w:val="404040" w:themeColor="text1" w:themeTint="BF"/>
           <w:szCs w:val="21"/>
@@ -1106,31 +1041,7 @@
           <w:color w:val="404040" w:themeColor="text1" w:themeTint="BF"/>
           <w:szCs w:val="21"/>
         </w:rPr>
-        <w:t>，</w:t>
-      </w:r>
-      <w:r>
-        <w:rPr>
-          <w:rFonts w:ascii="Calibri" w:eastAsia="华文细黑" w:hAnsi="Calibri" w:cs="Calibri" w:hint="eastAsia"/>
-          <w:color w:val="404040" w:themeColor="text1" w:themeTint="BF"/>
-          <w:szCs w:val="21"/>
-        </w:rPr>
-        <w:t>深入理解</w:t>
-      </w:r>
-      <w:r>
-        <w:rPr>
-          <w:rFonts w:ascii="Calibri" w:eastAsia="华文细黑" w:hAnsi="Calibri" w:cs="Calibri"/>
-          <w:color w:val="404040" w:themeColor="text1" w:themeTint="BF"/>
-          <w:szCs w:val="21"/>
-        </w:rPr>
-        <w:t>多线程、并发</w:t>
-      </w:r>
-      <w:r>
-        <w:rPr>
-          <w:rFonts w:ascii="Calibri" w:eastAsia="华文细黑" w:hAnsi="Calibri" w:cs="Calibri" w:hint="eastAsia"/>
-          <w:color w:val="404040" w:themeColor="text1" w:themeTint="BF"/>
-          <w:szCs w:val="21"/>
-        </w:rPr>
-        <w:t>编程、</w:t>
+        <w:t>核心技术，熟悉</w:t>
       </w:r>
       <w:r>
         <w:rPr>
@@ -1146,15 +1057,225 @@
           <w:color w:val="404040" w:themeColor="text1" w:themeTint="BF"/>
           <w:szCs w:val="21"/>
         </w:rPr>
-        <w:t>原理</w:t>
-      </w:r>
-      <w:r>
-        <w:rPr>
-          <w:rFonts w:ascii="Calibri" w:eastAsia="华文细黑" w:hAnsi="Calibri" w:cs="Calibri" w:hint="eastAsia"/>
-          <w:color w:val="404040" w:themeColor="text1" w:themeTint="BF"/>
-          <w:szCs w:val="21"/>
-        </w:rPr>
-        <w:t>及性能优化，熟练运用设计模式</w:t>
+        <w:t>原理及优化，熟练运用设计模式。熟练掌握</w:t>
+      </w:r>
+      <w:r>
+        <w:rPr>
+          <w:rFonts w:ascii="Calibri" w:eastAsia="华文细黑" w:hAnsi="Calibri" w:cs="Calibri"/>
+          <w:color w:val="404040" w:themeColor="text1" w:themeTint="BF"/>
+          <w:szCs w:val="21"/>
+        </w:rPr>
+        <w:t>Redis</w:t>
+      </w:r>
+      <w:r>
+        <w:rPr>
+          <w:rFonts w:ascii="Calibri" w:eastAsia="华文细黑" w:hAnsi="Calibri" w:cs="Calibri"/>
+          <w:color w:val="404040" w:themeColor="text1" w:themeTint="BF"/>
+          <w:szCs w:val="21"/>
+        </w:rPr>
+        <w:t>、</w:t>
+      </w:r>
+      <w:r>
+        <w:rPr>
+          <w:rFonts w:ascii="Calibri" w:eastAsia="华文细黑" w:hAnsi="Calibri" w:cs="Calibri"/>
+          <w:color w:val="404040" w:themeColor="text1" w:themeTint="BF"/>
+          <w:szCs w:val="21"/>
+        </w:rPr>
+        <w:t>Kafka</w:t>
+      </w:r>
+      <w:r>
+        <w:rPr>
+          <w:rFonts w:ascii="Calibri" w:eastAsia="华文细黑" w:hAnsi="Calibri" w:cs="Calibri"/>
+          <w:color w:val="404040" w:themeColor="text1" w:themeTint="BF"/>
+          <w:szCs w:val="21"/>
+        </w:rPr>
+        <w:t>、</w:t>
+      </w:r>
+      <w:r>
+        <w:rPr>
+          <w:rFonts w:ascii="Calibri" w:eastAsia="华文细黑" w:hAnsi="Calibri" w:cs="Calibri"/>
+          <w:color w:val="404040" w:themeColor="text1" w:themeTint="BF"/>
+          <w:szCs w:val="21"/>
+        </w:rPr>
+        <w:t>MySQL</w:t>
+      </w:r>
+      <w:r>
+        <w:rPr>
+          <w:rFonts w:ascii="Calibri" w:eastAsia="华文细黑" w:hAnsi="Calibri" w:cs="Calibri"/>
+          <w:color w:val="404040" w:themeColor="text1" w:themeTint="BF"/>
+          <w:szCs w:val="21"/>
+        </w:rPr>
+        <w:t>等中间件，具备</w:t>
+      </w:r>
+      <w:r>
+        <w:rPr>
+          <w:rFonts w:ascii="Calibri" w:eastAsia="华文细黑" w:hAnsi="Calibri" w:cs="Calibri"/>
+          <w:color w:val="404040" w:themeColor="text1" w:themeTint="BF"/>
+          <w:szCs w:val="21"/>
+        </w:rPr>
+        <w:t>SQL</w:t>
+      </w:r>
+      <w:r>
+        <w:rPr>
+          <w:rFonts w:ascii="Calibri" w:eastAsia="华文细黑" w:hAnsi="Calibri" w:cs="Calibri"/>
+          <w:color w:val="404040" w:themeColor="text1" w:themeTint="BF"/>
+          <w:szCs w:val="21"/>
+        </w:rPr>
+        <w:t>优化与分库分表实践经验</w:t>
+      </w:r>
+      <w:r>
+        <w:rPr>
+          <w:rFonts w:ascii="Calibri" w:eastAsia="华文细黑" w:hAnsi="Calibri" w:cs="Calibri" w:hint="eastAsia"/>
+          <w:color w:val="404040" w:themeColor="text1" w:themeTint="BF"/>
+          <w:szCs w:val="21"/>
+        </w:rPr>
+        <w:t>；</w:t>
+      </w:r>
+      <w:r>
+        <w:rPr>
+          <w:rFonts w:ascii="Calibri" w:eastAsia="华文细黑" w:hAnsi="Calibri" w:cs="Calibri"/>
+          <w:color w:val="404040" w:themeColor="text1" w:themeTint="BF"/>
+          <w:szCs w:val="21"/>
+        </w:rPr>
+        <w:t>熟悉</w:t>
+      </w:r>
+      <w:r>
+        <w:rPr>
+          <w:rFonts w:ascii="Calibri" w:eastAsia="华文细黑" w:hAnsi="Calibri" w:cs="Calibri"/>
+          <w:color w:val="404040" w:themeColor="text1" w:themeTint="BF"/>
+          <w:szCs w:val="21"/>
+        </w:rPr>
+        <w:t xml:space="preserve"> Vue</w:t>
+      </w:r>
+      <w:r>
+        <w:rPr>
+          <w:rFonts w:ascii="Calibri" w:eastAsia="华文细黑" w:hAnsi="Calibri" w:cs="Calibri"/>
+          <w:color w:val="404040" w:themeColor="text1" w:themeTint="BF"/>
+          <w:szCs w:val="21"/>
+        </w:rPr>
+        <w:t>、</w:t>
+      </w:r>
+      <w:r>
+        <w:rPr>
+          <w:rFonts w:ascii="Calibri" w:eastAsia="华文细黑" w:hAnsi="Calibri" w:cs="Calibri"/>
+          <w:color w:val="404040" w:themeColor="text1" w:themeTint="BF"/>
+          <w:szCs w:val="21"/>
+        </w:rPr>
+        <w:t>TS</w:t>
+      </w:r>
+      <w:r>
+        <w:rPr>
+          <w:rFonts w:ascii="Calibri" w:eastAsia="华文细黑" w:hAnsi="Calibri" w:cs="Calibri"/>
+          <w:color w:val="404040" w:themeColor="text1" w:themeTint="BF"/>
+          <w:szCs w:val="21"/>
+        </w:rPr>
+        <w:t>等前端技术，具备全栈开发与前后端无缝联调能力；熟练使用</w:t>
+      </w:r>
+      <w:r>
+        <w:rPr>
+          <w:rFonts w:ascii="Calibri" w:eastAsia="华文细黑" w:hAnsi="Calibri" w:cs="Calibri"/>
+          <w:color w:val="404040" w:themeColor="text1" w:themeTint="BF"/>
+          <w:szCs w:val="21"/>
+        </w:rPr>
+        <w:t xml:space="preserve"> Python </w:t>
+      </w:r>
+      <w:r>
+        <w:rPr>
+          <w:rFonts w:ascii="Calibri" w:eastAsia="华文细黑" w:hAnsi="Calibri" w:cs="Calibri"/>
+          <w:color w:val="404040" w:themeColor="text1" w:themeTint="BF"/>
+          <w:szCs w:val="21"/>
+        </w:rPr>
+        <w:t>及</w:t>
+      </w:r>
+      <w:r>
+        <w:rPr>
+          <w:rFonts w:ascii="Calibri" w:eastAsia="华文细黑" w:hAnsi="Calibri" w:cs="Calibri"/>
+          <w:color w:val="404040" w:themeColor="text1" w:themeTint="BF"/>
+          <w:szCs w:val="21"/>
+        </w:rPr>
+        <w:t xml:space="preserve"> Shell </w:t>
+      </w:r>
+      <w:r>
+        <w:rPr>
+          <w:rFonts w:ascii="Calibri" w:eastAsia="华文细黑" w:hAnsi="Calibri" w:cs="Calibri"/>
+          <w:color w:val="404040" w:themeColor="text1" w:themeTint="BF"/>
+          <w:szCs w:val="21"/>
+        </w:rPr>
+        <w:t>脚本进行开发与线上问题排查；熟练运用</w:t>
+      </w:r>
+      <w:r>
+        <w:rPr>
+          <w:rFonts w:ascii="Calibri" w:eastAsia="华文细黑" w:hAnsi="Calibri" w:cs="Calibri"/>
+          <w:color w:val="404040" w:themeColor="text1" w:themeTint="BF"/>
+          <w:szCs w:val="21"/>
+        </w:rPr>
+        <w:t xml:space="preserve"> AI Coding </w:t>
+      </w:r>
+      <w:r>
+        <w:rPr>
+          <w:rFonts w:ascii="Calibri" w:eastAsia="华文细黑" w:hAnsi="Calibri" w:cs="Calibri"/>
+          <w:color w:val="404040" w:themeColor="text1" w:themeTint="BF"/>
+          <w:szCs w:val="21"/>
+        </w:rPr>
+        <w:t>工具开发（</w:t>
+      </w:r>
+      <w:r>
+        <w:rPr>
+          <w:rFonts w:ascii="Calibri" w:eastAsia="华文细黑" w:hAnsi="Calibri" w:cs="Calibri"/>
+          <w:color w:val="404040" w:themeColor="text1" w:themeTint="BF"/>
+          <w:szCs w:val="21"/>
+        </w:rPr>
+        <w:t>Claude Code</w:t>
+      </w:r>
+      <w:r>
+        <w:rPr>
+          <w:rFonts w:ascii="Calibri" w:eastAsia="华文细黑" w:hAnsi="Calibri" w:cs="Calibri"/>
+          <w:color w:val="404040" w:themeColor="text1" w:themeTint="BF"/>
+          <w:szCs w:val="21"/>
+        </w:rPr>
+        <w:t>、</w:t>
+      </w:r>
+      <w:proofErr w:type="spellStart"/>
+      <w:r>
+        <w:rPr>
+          <w:rFonts w:ascii="Calibri" w:eastAsia="华文细黑" w:hAnsi="Calibri" w:cs="Calibri"/>
+          <w:color w:val="404040" w:themeColor="text1" w:themeTint="BF"/>
+          <w:szCs w:val="21"/>
+        </w:rPr>
+        <w:t>OpenCode</w:t>
+      </w:r>
+      <w:proofErr w:type="spellEnd"/>
+      <w:r>
+        <w:rPr>
+          <w:rFonts w:ascii="Calibri" w:eastAsia="华文细黑" w:hAnsi="Calibri" w:cs="Calibri"/>
+          <w:color w:val="404040" w:themeColor="text1" w:themeTint="BF"/>
+          <w:szCs w:val="21"/>
+        </w:rPr>
+        <w:t>等），</w:t>
+      </w:r>
+      <w:r>
+        <w:rPr>
+          <w:rFonts w:ascii="Calibri" w:eastAsia="华文细黑" w:hAnsi="Calibri" w:cs="Calibri" w:hint="eastAsia"/>
+          <w:color w:val="404040" w:themeColor="text1" w:themeTint="BF"/>
+          <w:szCs w:val="21"/>
+        </w:rPr>
+        <w:t>了解</w:t>
+      </w:r>
+      <w:r>
+        <w:rPr>
+          <w:rFonts w:ascii="Calibri" w:eastAsia="华文细黑" w:hAnsi="Calibri" w:cs="Calibri"/>
+          <w:color w:val="404040" w:themeColor="text1" w:themeTint="BF"/>
+          <w:szCs w:val="21"/>
+        </w:rPr>
+        <w:t>AI</w:t>
+      </w:r>
+      <w:r>
+        <w:rPr>
+          <w:rFonts w:ascii="Calibri" w:eastAsia="华文细黑" w:hAnsi="Calibri" w:cs="Calibri"/>
+          <w:color w:val="404040" w:themeColor="text1" w:themeTint="BF"/>
+          <w:szCs w:val="21"/>
+        </w:rPr>
+        <w:t>编程工具的基础原理和开发流程优化</w:t>
       </w:r>
     </w:p>
     <w:p>
@@ -1162,71 +1283,113 @@
         <w:pStyle w:val="a3"/>
         <w:numPr>
           <w:ilvl w:val="0"/>
-          <w:numId w:val="10"/>
+          <w:numId w:val="36"/>
         </w:numPr>
-        <w:spacing w:line="320" w:lineRule="exact"/>
-        <w:ind w:left="357" w:firstLineChars="0" w:hanging="357"/>
-        <w:rPr>
-          <w:rFonts w:ascii="Calibri" w:eastAsia="华文细黑" w:hAnsi="Calibri" w:cs="Calibri"/>
-          <w:color w:val="404040" w:themeColor="text1" w:themeTint="BF"/>
-          <w:szCs w:val="21"/>
-        </w:rPr>
-      </w:pPr>
-      <w:r>
-        <w:rPr>
-          <w:rFonts w:ascii="Calibri" w:eastAsia="华文细黑" w:hAnsi="Calibri" w:cs="Calibri"/>
-          <w:color w:val="404040" w:themeColor="text1" w:themeTint="BF"/>
-          <w:szCs w:val="21"/>
-        </w:rPr>
-        <w:t>熟悉分布式系统</w:t>
-      </w:r>
-      <w:r>
-        <w:rPr>
-          <w:rFonts w:ascii="Calibri" w:eastAsia="华文细黑" w:hAnsi="Calibri" w:cs="Calibri"/>
-          <w:color w:val="404040" w:themeColor="text1" w:themeTint="BF"/>
-          <w:szCs w:val="21"/>
-        </w:rPr>
-        <w:t>设计</w:t>
-      </w:r>
-      <w:r>
-        <w:rPr>
-          <w:rFonts w:ascii="Calibri" w:eastAsia="华文细黑" w:hAnsi="Calibri" w:cs="Calibri"/>
-          <w:color w:val="404040" w:themeColor="text1" w:themeTint="BF"/>
-          <w:szCs w:val="21"/>
-        </w:rPr>
-        <w:t>，</w:t>
-      </w:r>
-      <w:r>
-        <w:rPr>
-          <w:rFonts w:ascii="Calibri" w:eastAsia="华文细黑" w:hAnsi="Calibri" w:cs="Calibri"/>
-          <w:color w:val="404040" w:themeColor="text1" w:themeTint="BF"/>
-          <w:szCs w:val="21"/>
-        </w:rPr>
-        <w:t>具备高并发</w:t>
-      </w:r>
-      <w:r>
-        <w:rPr>
-          <w:rFonts w:ascii="Calibri" w:eastAsia="华文细黑" w:hAnsi="Calibri" w:cs="Calibri" w:hint="eastAsia"/>
-          <w:color w:val="404040" w:themeColor="text1" w:themeTint="BF"/>
-          <w:szCs w:val="21"/>
-        </w:rPr>
-        <w:t>、高可靠、高性能</w:t>
-      </w:r>
-      <w:r>
-        <w:rPr>
-          <w:rFonts w:ascii="Calibri" w:eastAsia="华文细黑" w:hAnsi="Calibri" w:cs="Calibri"/>
-          <w:color w:val="404040" w:themeColor="text1" w:themeTint="BF"/>
-          <w:szCs w:val="21"/>
-        </w:rPr>
-        <w:t>系统设计经验</w:t>
-      </w:r>
-      <w:r>
-        <w:rPr>
-          <w:rFonts w:ascii="Calibri" w:eastAsia="华文细黑" w:hAnsi="Calibri" w:cs="Calibri" w:hint="eastAsia"/>
-          <w:color w:val="404040" w:themeColor="text1" w:themeTint="BF"/>
-          <w:szCs w:val="21"/>
-        </w:rPr>
-        <w:t>，</w:t>
+        <w:spacing w:line="300" w:lineRule="exact"/>
+        <w:ind w:left="442" w:firstLineChars="0" w:hanging="442"/>
+        <w:rPr>
+          <w:rFonts w:ascii="Calibri" w:eastAsia="华文细黑" w:hAnsi="Calibri" w:cs="Calibri"/>
+          <w:color w:val="404040" w:themeColor="text1" w:themeTint="BF"/>
+          <w:szCs w:val="21"/>
+        </w:rPr>
+      </w:pPr>
+      <w:r>
+        <w:rPr>
+          <w:rFonts w:ascii="Calibri" w:eastAsia="华文细黑" w:hAnsi="Calibri" w:cs="Calibri"/>
+          <w:b/>
+          <w:bCs/>
+          <w:color w:val="404040" w:themeColor="text1" w:themeTint="BF"/>
+          <w:szCs w:val="21"/>
+        </w:rPr>
+        <w:t>架构能力：</w:t>
+      </w:r>
+      <w:r>
+        <w:rPr>
+          <w:rFonts w:ascii="Calibri" w:eastAsia="华文细黑" w:hAnsi="Calibri" w:cs="Calibri"/>
+          <w:color w:val="404040" w:themeColor="text1" w:themeTint="BF"/>
+          <w:szCs w:val="21"/>
+        </w:rPr>
+        <w:t>深入理解分布式微服务架构，具备日均</w:t>
+      </w:r>
+      <w:r>
+        <w:rPr>
+          <w:rFonts w:ascii="Calibri" w:eastAsia="华文细黑" w:hAnsi="Calibri" w:cs="Calibri"/>
+          <w:color w:val="404040" w:themeColor="text1" w:themeTint="BF"/>
+          <w:szCs w:val="21"/>
+        </w:rPr>
+        <w:t xml:space="preserve"> 3</w:t>
+      </w:r>
+      <w:r>
+        <w:rPr>
+          <w:rFonts w:ascii="Calibri" w:eastAsia="华文细黑" w:hAnsi="Calibri" w:cs="Calibri"/>
+          <w:color w:val="404040" w:themeColor="text1" w:themeTint="BF"/>
+          <w:szCs w:val="21"/>
+        </w:rPr>
+        <w:t>亿</w:t>
+      </w:r>
+      <w:r>
+        <w:rPr>
+          <w:rFonts w:ascii="Calibri" w:eastAsia="华文细黑" w:hAnsi="Calibri" w:cs="Calibri"/>
+          <w:color w:val="404040" w:themeColor="text1" w:themeTint="BF"/>
+          <w:szCs w:val="21"/>
+        </w:rPr>
+        <w:t>+</w:t>
+      </w:r>
+      <w:r>
+        <w:rPr>
+          <w:rFonts w:ascii="Calibri" w:eastAsia="华文细黑" w:hAnsi="Calibri" w:cs="Calibri"/>
+          <w:color w:val="404040" w:themeColor="text1" w:themeTint="BF"/>
+          <w:szCs w:val="21"/>
+        </w:rPr>
+        <w:t>请求量、峰值</w:t>
+      </w:r>
+      <w:r>
+        <w:rPr>
+          <w:rFonts w:ascii="Calibri" w:eastAsia="华文细黑" w:hAnsi="Calibri" w:cs="Calibri"/>
+          <w:color w:val="404040" w:themeColor="text1" w:themeTint="BF"/>
+          <w:szCs w:val="21"/>
+        </w:rPr>
+        <w:t xml:space="preserve"> TPS 10000+ </w:t>
+      </w:r>
+      <w:r>
+        <w:rPr>
+          <w:rFonts w:ascii="Calibri" w:eastAsia="华文细黑" w:hAnsi="Calibri" w:cs="Calibri"/>
+          <w:color w:val="404040" w:themeColor="text1" w:themeTint="BF"/>
+          <w:szCs w:val="21"/>
+        </w:rPr>
+        <w:t>的大型系统从</w:t>
+      </w:r>
+      <w:r>
+        <w:rPr>
+          <w:rFonts w:ascii="Calibri" w:eastAsia="华文细黑" w:hAnsi="Calibri" w:cs="Calibri"/>
+          <w:color w:val="404040" w:themeColor="text1" w:themeTint="BF"/>
+          <w:szCs w:val="21"/>
+        </w:rPr>
+        <w:t xml:space="preserve">0 </w:t>
+      </w:r>
+      <w:r>
+        <w:rPr>
+          <w:rFonts w:ascii="Calibri" w:eastAsia="华文细黑" w:hAnsi="Calibri" w:cs="Calibri"/>
+          <w:color w:val="404040" w:themeColor="text1" w:themeTint="BF"/>
+          <w:szCs w:val="21"/>
+        </w:rPr>
+        <w:t>到</w:t>
+      </w:r>
+      <w:r>
+        <w:rPr>
+          <w:rFonts w:ascii="Calibri" w:eastAsia="华文细黑" w:hAnsi="Calibri" w:cs="Calibri"/>
+          <w:color w:val="404040" w:themeColor="text1" w:themeTint="BF"/>
+          <w:szCs w:val="21"/>
+        </w:rPr>
+        <w:t xml:space="preserve"> 1 </w:t>
+      </w:r>
+      <w:r>
+        <w:rPr>
+          <w:rFonts w:ascii="Calibri" w:eastAsia="华文细黑" w:hAnsi="Calibri" w:cs="Calibri"/>
+          <w:color w:val="404040" w:themeColor="text1" w:themeTint="BF"/>
+          <w:szCs w:val="21"/>
+        </w:rPr>
+        <w:t>设计经验；擅长复杂业务进行分析和抽象和实现（如规则引擎），对负责的系统有规划和演进能力，保障系统高并发、高可靠、高性能</w:t>
       </w:r>
     </w:p>
     <w:p>
@@ -1234,55 +1397,111 @@
         <w:pStyle w:val="a3"/>
         <w:numPr>
           <w:ilvl w:val="0"/>
-          <w:numId w:val="10"/>
+          <w:numId w:val="36"/>
         </w:numPr>
-        <w:spacing w:line="320" w:lineRule="exact"/>
-        <w:ind w:left="357" w:firstLineChars="0" w:hanging="357"/>
-        <w:rPr>
-          <w:rFonts w:ascii="Calibri" w:eastAsia="华文细黑" w:hAnsi="Calibri" w:cs="Calibri"/>
-          <w:color w:val="404040" w:themeColor="text1" w:themeTint="BF"/>
-          <w:szCs w:val="21"/>
-        </w:rPr>
-      </w:pPr>
-      <w:r>
-        <w:rPr>
-          <w:rFonts w:ascii="Calibri" w:eastAsia="华文细黑" w:hAnsi="Calibri" w:cs="Calibri" w:hint="eastAsia"/>
-          <w:color w:val="404040" w:themeColor="text1" w:themeTint="BF"/>
-          <w:szCs w:val="21"/>
-        </w:rPr>
-        <w:t>熟悉常用分布式组件，熟练使用</w:t>
-      </w:r>
-      <w:r>
-        <w:rPr>
-          <w:rFonts w:ascii="Calibri" w:eastAsia="华文细黑" w:hAnsi="Calibri" w:cs="Calibri" w:hint="eastAsia"/>
-          <w:color w:val="404040" w:themeColor="text1" w:themeTint="BF"/>
-          <w:szCs w:val="21"/>
-        </w:rPr>
-        <w:t>MySQL</w:t>
-      </w:r>
-      <w:r>
-        <w:rPr>
-          <w:rFonts w:ascii="Calibri" w:eastAsia="华文细黑" w:hAnsi="Calibri" w:cs="Calibri" w:hint="eastAsia"/>
-          <w:color w:val="404040" w:themeColor="text1" w:themeTint="BF"/>
-          <w:szCs w:val="21"/>
-        </w:rPr>
-        <w:t>等常用数据库，对</w:t>
-      </w:r>
-      <w:r>
-        <w:rPr>
-          <w:rFonts w:ascii="Calibri" w:eastAsia="华文细黑" w:hAnsi="Calibri" w:cs="Calibri" w:hint="eastAsia"/>
-          <w:color w:val="404040" w:themeColor="text1" w:themeTint="BF"/>
-          <w:szCs w:val="21"/>
-        </w:rPr>
-        <w:t>SQL</w:t>
-      </w:r>
-      <w:r>
-        <w:rPr>
-          <w:rFonts w:ascii="Calibri" w:eastAsia="华文细黑" w:hAnsi="Calibri" w:cs="Calibri" w:hint="eastAsia"/>
-          <w:color w:val="404040" w:themeColor="text1" w:themeTint="BF"/>
-          <w:szCs w:val="21"/>
-        </w:rPr>
-        <w:t>优化有实际的实践经验</w:t>
+        <w:spacing w:line="300" w:lineRule="exact"/>
+        <w:ind w:left="442" w:firstLineChars="0" w:hanging="442"/>
+        <w:rPr>
+          <w:rFonts w:ascii="Calibri" w:eastAsia="华文细黑" w:hAnsi="Calibri" w:cs="Calibri"/>
+          <w:color w:val="404040" w:themeColor="text1" w:themeTint="BF"/>
+          <w:szCs w:val="21"/>
+        </w:rPr>
+      </w:pPr>
+      <w:r>
+        <w:rPr>
+          <w:rFonts w:ascii="Calibri" w:eastAsia="华文细黑" w:hAnsi="Calibri" w:cs="Calibri"/>
+          <w:b/>
+          <w:bCs/>
+          <w:color w:val="404040" w:themeColor="text1" w:themeTint="BF"/>
+          <w:szCs w:val="21"/>
+        </w:rPr>
+        <w:t>模型训练与</w:t>
+      </w:r>
+      <w:r>
+        <w:rPr>
+          <w:rFonts w:ascii="Calibri" w:eastAsia="华文细黑" w:hAnsi="Calibri" w:cs="Calibri"/>
+          <w:b/>
+          <w:bCs/>
+          <w:color w:val="404040" w:themeColor="text1" w:themeTint="BF"/>
+          <w:szCs w:val="21"/>
+        </w:rPr>
+        <w:t>AI</w:t>
+      </w:r>
+      <w:r>
+        <w:rPr>
+          <w:rFonts w:ascii="Calibri" w:eastAsia="华文细黑" w:hAnsi="Calibri" w:cs="Calibri"/>
+          <w:b/>
+          <w:bCs/>
+          <w:color w:val="404040" w:themeColor="text1" w:themeTint="BF"/>
+          <w:szCs w:val="21"/>
+        </w:rPr>
+        <w:t>应用能力</w:t>
+      </w:r>
+      <w:r>
+        <w:rPr>
+          <w:rFonts w:ascii="Calibri" w:eastAsia="华文细黑" w:hAnsi="Calibri" w:cs="Calibri"/>
+          <w:color w:val="404040" w:themeColor="text1" w:themeTint="BF"/>
+          <w:szCs w:val="21"/>
+        </w:rPr>
+        <w:t>：具备大模型应用（智能导购）</w:t>
+      </w:r>
+      <w:r>
+        <w:rPr>
+          <w:rFonts w:ascii="Calibri" w:eastAsia="华文细黑" w:hAnsi="Calibri" w:cs="Calibri" w:hint="eastAsia"/>
+          <w:color w:val="404040" w:themeColor="text1" w:themeTint="BF"/>
+          <w:szCs w:val="21"/>
+        </w:rPr>
+        <w:t>的落地</w:t>
+      </w:r>
+      <w:r>
+        <w:rPr>
+          <w:rFonts w:ascii="Calibri" w:eastAsia="华文细黑" w:hAnsi="Calibri" w:cs="Calibri"/>
+          <w:color w:val="404040" w:themeColor="text1" w:themeTint="BF"/>
+          <w:szCs w:val="21"/>
+        </w:rPr>
+        <w:t>开发实践经验，具备图像分类和目标检测模型</w:t>
+      </w:r>
+      <w:r>
+        <w:rPr>
+          <w:rFonts w:ascii="Calibri" w:eastAsia="华文细黑" w:hAnsi="Calibri" w:cs="Calibri" w:hint="eastAsia"/>
+          <w:color w:val="404040" w:themeColor="text1" w:themeTint="BF"/>
+          <w:szCs w:val="21"/>
+        </w:rPr>
+        <w:t>的</w:t>
+      </w:r>
+      <w:r>
+        <w:rPr>
+          <w:rFonts w:ascii="Calibri" w:eastAsia="华文细黑" w:hAnsi="Calibri" w:cs="Calibri"/>
+          <w:color w:val="404040" w:themeColor="text1" w:themeTint="BF"/>
+          <w:szCs w:val="21"/>
+        </w:rPr>
+        <w:t>训练经验（</w:t>
+      </w:r>
+      <w:r>
+        <w:rPr>
+          <w:rFonts w:ascii="Calibri" w:eastAsia="华文细黑" w:hAnsi="Calibri" w:cs="Calibri"/>
+          <w:color w:val="404040" w:themeColor="text1" w:themeTint="BF"/>
+          <w:szCs w:val="21"/>
+        </w:rPr>
+        <w:t xml:space="preserve">YOLOv8 / </w:t>
+      </w:r>
+      <w:proofErr w:type="spellStart"/>
+      <w:r>
+        <w:rPr>
+          <w:rFonts w:ascii="Calibri" w:eastAsia="华文细黑" w:hAnsi="Calibri" w:cs="Calibri"/>
+          <w:color w:val="404040" w:themeColor="text1" w:themeTint="BF"/>
+          <w:szCs w:val="21"/>
+        </w:rPr>
+        <w:t>EfficientNet</w:t>
+      </w:r>
+      <w:proofErr w:type="spellEnd"/>
+      <w:r>
+        <w:rPr>
+          <w:rFonts w:ascii="Calibri" w:eastAsia="华文细黑" w:hAnsi="Calibri" w:cs="Calibri"/>
+          <w:color w:val="404040" w:themeColor="text1" w:themeTint="BF"/>
+          <w:szCs w:val="21"/>
+        </w:rPr>
+        <w:t>），了解深度学习和大模型基本原理</w:t>
       </w:r>
     </w:p>
     <w:p>
@@ -1290,399 +1509,33 @@
         <w:pStyle w:val="a3"/>
         <w:numPr>
           <w:ilvl w:val="0"/>
-          <w:numId w:val="10"/>
+          <w:numId w:val="36"/>
         </w:numPr>
-        <w:spacing w:line="320" w:lineRule="exact"/>
-        <w:ind w:left="357" w:firstLineChars="0" w:hanging="357"/>
-        <w:rPr>
-          <w:rFonts w:ascii="Calibri" w:eastAsia="华文细黑" w:hAnsi="Calibri" w:cs="Calibri"/>
-          <w:color w:val="404040" w:themeColor="text1" w:themeTint="BF"/>
-          <w:szCs w:val="21"/>
-        </w:rPr>
-      </w:pPr>
-      <w:r>
-        <w:rPr>
-          <w:rFonts w:ascii="Calibri" w:eastAsia="华文细黑" w:hAnsi="Calibri" w:cs="Calibri" w:hint="eastAsia"/>
-          <w:color w:val="404040" w:themeColor="text1" w:themeTint="BF"/>
-          <w:szCs w:val="21"/>
-        </w:rPr>
-        <w:t>熟悉</w:t>
-      </w:r>
-      <w:r>
-        <w:rPr>
-          <w:rFonts w:ascii="Calibri" w:eastAsia="华文细黑" w:hAnsi="Calibri" w:cs="Calibri" w:hint="eastAsia"/>
-          <w:color w:val="404040" w:themeColor="text1" w:themeTint="BF"/>
-          <w:szCs w:val="21"/>
-        </w:rPr>
-        <w:t>VUE</w:t>
-      </w:r>
-      <w:r>
-        <w:rPr>
-          <w:rFonts w:ascii="Calibri" w:eastAsia="华文细黑" w:hAnsi="Calibri" w:cs="Calibri" w:hint="eastAsia"/>
-          <w:color w:val="404040" w:themeColor="text1" w:themeTint="BF"/>
-          <w:szCs w:val="21"/>
-        </w:rPr>
-        <w:t>、</w:t>
-      </w:r>
-      <w:r>
-        <w:rPr>
-          <w:rFonts w:ascii="Calibri" w:eastAsia="华文细黑" w:hAnsi="Calibri" w:cs="Calibri" w:hint="eastAsia"/>
-          <w:color w:val="404040" w:themeColor="text1" w:themeTint="BF"/>
-          <w:szCs w:val="21"/>
-        </w:rPr>
-        <w:t>TS</w:t>
-      </w:r>
-      <w:r>
-        <w:rPr>
-          <w:rFonts w:ascii="Calibri" w:eastAsia="华文细黑" w:hAnsi="Calibri" w:cs="Calibri" w:hint="eastAsia"/>
-          <w:color w:val="404040" w:themeColor="text1" w:themeTint="BF"/>
-          <w:szCs w:val="21"/>
-        </w:rPr>
-        <w:t>等前端技术，具备前端开发能力</w:t>
-      </w:r>
-      <w:r>
-        <w:rPr>
-          <w:rFonts w:ascii="Calibri" w:eastAsia="华文细黑" w:hAnsi="Calibri" w:cs="Calibri"/>
-          <w:color w:val="404040" w:themeColor="text1" w:themeTint="BF"/>
-          <w:szCs w:val="21"/>
-        </w:rPr>
-        <w:t>，可独立完成前后端联调</w:t>
-      </w:r>
-    </w:p>
-    <w:p>
-      <w:pPr>
-        <w:pStyle w:val="a3"/>
-        <w:numPr>
-          <w:ilvl w:val="0"/>
-          <w:numId w:val="10"/>
-        </w:numPr>
-        <w:spacing w:line="320" w:lineRule="exact"/>
-        <w:ind w:left="357" w:firstLineChars="0" w:hanging="357"/>
-        <w:rPr>
-          <w:rFonts w:ascii="Calibri" w:eastAsia="华文细黑" w:hAnsi="Calibri" w:cs="Calibri"/>
-          <w:color w:val="404040" w:themeColor="text1" w:themeTint="BF"/>
-          <w:szCs w:val="21"/>
-        </w:rPr>
-      </w:pPr>
-      <w:r>
-        <w:rPr>
-          <w:rFonts w:ascii="Calibri" w:eastAsia="华文细黑" w:hAnsi="Calibri" w:cs="Calibri" w:hint="eastAsia"/>
-          <w:color w:val="404040" w:themeColor="text1" w:themeTint="BF"/>
-          <w:szCs w:val="21"/>
-        </w:rPr>
-        <w:t>熟悉</w:t>
-      </w:r>
-      <w:r>
-        <w:rPr>
-          <w:rFonts w:ascii="Calibri" w:eastAsia="华文细黑" w:hAnsi="Calibri" w:cs="Calibri" w:hint="eastAsia"/>
-          <w:color w:val="404040" w:themeColor="text1" w:themeTint="BF"/>
-          <w:szCs w:val="21"/>
-        </w:rPr>
-        <w:t>P</w:t>
-      </w:r>
-      <w:r>
-        <w:rPr>
-          <w:rFonts w:ascii="Calibri" w:eastAsia="华文细黑" w:hAnsi="Calibri" w:cs="Calibri" w:hint="eastAsia"/>
-          <w:color w:val="404040" w:themeColor="text1" w:themeTint="BF"/>
-          <w:szCs w:val="21"/>
-        </w:rPr>
-        <w:t>ython</w:t>
-      </w:r>
-      <w:r>
-        <w:rPr>
-          <w:rFonts w:ascii="Calibri" w:eastAsia="华文细黑" w:hAnsi="Calibri" w:cs="Calibri" w:hint="eastAsia"/>
-          <w:color w:val="404040" w:themeColor="text1" w:themeTint="BF"/>
-          <w:szCs w:val="21"/>
-        </w:rPr>
-        <w:t>、</w:t>
-      </w:r>
-      <w:r>
-        <w:rPr>
-          <w:rFonts w:ascii="Calibri" w:eastAsia="华文细黑" w:hAnsi="Calibri" w:cs="Calibri" w:hint="eastAsia"/>
-          <w:color w:val="404040" w:themeColor="text1" w:themeTint="BF"/>
-          <w:szCs w:val="21"/>
-        </w:rPr>
-        <w:t xml:space="preserve">Linux </w:t>
-      </w:r>
-      <w:r>
-        <w:rPr>
-          <w:rFonts w:ascii="Calibri" w:eastAsia="华文细黑" w:hAnsi="Calibri" w:cs="Calibri" w:hint="eastAsia"/>
-          <w:color w:val="404040" w:themeColor="text1" w:themeTint="BF"/>
-          <w:szCs w:val="21"/>
-        </w:rPr>
-        <w:t>bash</w:t>
-      </w:r>
-      <w:r>
-        <w:rPr>
-          <w:rFonts w:ascii="Calibri" w:eastAsia="华文细黑" w:hAnsi="Calibri" w:cs="Calibri" w:hint="eastAsia"/>
-          <w:color w:val="404040" w:themeColor="text1" w:themeTint="BF"/>
-          <w:szCs w:val="21"/>
-        </w:rPr>
-        <w:t>脚本</w:t>
-      </w:r>
-      <w:r>
-        <w:rPr>
-          <w:rFonts w:ascii="Calibri" w:eastAsia="华文细黑" w:hAnsi="Calibri" w:cs="Calibri" w:hint="eastAsia"/>
-          <w:color w:val="404040" w:themeColor="text1" w:themeTint="BF"/>
-          <w:szCs w:val="21"/>
-        </w:rPr>
-        <w:t>常用命令</w:t>
-      </w:r>
-      <w:r>
-        <w:rPr>
-          <w:rFonts w:ascii="Calibri" w:eastAsia="华文细黑" w:hAnsi="Calibri" w:cs="Calibri" w:hint="eastAsia"/>
-          <w:color w:val="404040" w:themeColor="text1" w:themeTint="BF"/>
-          <w:szCs w:val="21"/>
-        </w:rPr>
-        <w:t>，</w:t>
-      </w:r>
-      <w:r>
-        <w:rPr>
-          <w:rFonts w:ascii="Calibri" w:eastAsia="华文细黑" w:hAnsi="Calibri" w:cs="Calibri"/>
-          <w:color w:val="404040" w:themeColor="text1" w:themeTint="BF"/>
-          <w:szCs w:val="21"/>
-        </w:rPr>
-        <w:t>用于工具开发与辅助系统建设</w:t>
-      </w:r>
-      <w:r>
-        <w:rPr>
-          <w:rFonts w:ascii="Calibri" w:eastAsia="华文细黑" w:hAnsi="Calibri" w:cs="Calibri" w:hint="eastAsia"/>
-          <w:color w:val="404040" w:themeColor="text1" w:themeTint="BF"/>
-          <w:szCs w:val="21"/>
-        </w:rPr>
-        <w:t>和线上问题排查</w:t>
-      </w:r>
-    </w:p>
-    <w:p>
-      <w:pPr>
-        <w:pStyle w:val="a3"/>
-        <w:numPr>
-          <w:ilvl w:val="0"/>
-          <w:numId w:val="10"/>
-        </w:numPr>
-        <w:spacing w:line="320" w:lineRule="exact"/>
-        <w:ind w:left="357" w:firstLineChars="0" w:hanging="357"/>
-        <w:rPr>
-          <w:rFonts w:ascii="Calibri" w:eastAsia="华文细黑" w:hAnsi="Calibri" w:cs="Calibri"/>
-          <w:color w:val="404040" w:themeColor="text1" w:themeTint="BF"/>
-          <w:szCs w:val="21"/>
-        </w:rPr>
-      </w:pPr>
-      <w:r>
-        <w:rPr>
-          <w:rFonts w:ascii="Calibri" w:eastAsia="华文细黑" w:hAnsi="Calibri" w:cs="Calibri" w:hint="eastAsia"/>
-          <w:color w:val="404040" w:themeColor="text1" w:themeTint="BF"/>
-          <w:szCs w:val="21"/>
-        </w:rPr>
-        <w:t>有</w:t>
-      </w:r>
-      <w:r>
-        <w:rPr>
-          <w:rFonts w:ascii="Calibri" w:eastAsia="华文细黑" w:hAnsi="Calibri" w:cs="Calibri"/>
-          <w:color w:val="404040" w:themeColor="text1" w:themeTint="BF"/>
-          <w:szCs w:val="21"/>
-        </w:rPr>
-        <w:t>良好的跨团队沟通能力</w:t>
-      </w:r>
-      <w:r>
-        <w:rPr>
-          <w:rFonts w:ascii="Calibri" w:eastAsia="华文细黑" w:hAnsi="Calibri" w:cs="Calibri"/>
-          <w:color w:val="404040" w:themeColor="text1" w:themeTint="BF"/>
-          <w:szCs w:val="21"/>
-        </w:rPr>
-        <w:t>与技术带队经验</w:t>
-      </w:r>
-      <w:r>
-        <w:rPr>
-          <w:rFonts w:ascii="Calibri" w:eastAsia="华文细黑" w:hAnsi="Calibri" w:cs="Calibri"/>
-          <w:color w:val="404040" w:themeColor="text1" w:themeTint="BF"/>
-          <w:szCs w:val="21"/>
-        </w:rPr>
-        <w:t>，</w:t>
-      </w:r>
-      <w:r>
-        <w:rPr>
-          <w:rFonts w:ascii="Calibri" w:eastAsia="华文细黑" w:hAnsi="Calibri" w:cs="Calibri" w:hint="eastAsia"/>
-          <w:color w:val="404040" w:themeColor="text1" w:themeTint="BF"/>
-          <w:szCs w:val="21"/>
-        </w:rPr>
-        <w:t>能独立主导核心项目的架构落地与解决方案设计，具备从</w:t>
-      </w:r>
-      <w:r>
-        <w:rPr>
-          <w:rFonts w:ascii="Calibri" w:eastAsia="华文细黑" w:hAnsi="Calibri" w:cs="Calibri" w:hint="eastAsia"/>
-          <w:color w:val="404040" w:themeColor="text1" w:themeTint="BF"/>
-          <w:szCs w:val="21"/>
-        </w:rPr>
-        <w:t>0</w:t>
-      </w:r>
-      <w:r>
-        <w:rPr>
-          <w:rFonts w:ascii="Calibri" w:eastAsia="华文细黑" w:hAnsi="Calibri" w:cs="Calibri" w:hint="eastAsia"/>
-          <w:color w:val="404040" w:themeColor="text1" w:themeTint="BF"/>
-          <w:szCs w:val="21"/>
-        </w:rPr>
-        <w:t>到</w:t>
-      </w:r>
-      <w:r>
-        <w:rPr>
-          <w:rFonts w:ascii="Calibri" w:eastAsia="华文细黑" w:hAnsi="Calibri" w:cs="Calibri" w:hint="eastAsia"/>
-          <w:color w:val="404040" w:themeColor="text1" w:themeTint="BF"/>
-          <w:szCs w:val="21"/>
-        </w:rPr>
-        <w:t>1</w:t>
-      </w:r>
-      <w:r>
-        <w:rPr>
-          <w:rFonts w:ascii="Calibri" w:eastAsia="华文细黑" w:hAnsi="Calibri" w:cs="Calibri" w:hint="eastAsia"/>
-          <w:color w:val="404040" w:themeColor="text1" w:themeTint="BF"/>
-          <w:szCs w:val="21"/>
-        </w:rPr>
-        <w:t>搭建大型系统的能力</w:t>
-      </w:r>
-    </w:p>
-    <w:p>
-      <w:pPr>
-        <w:pStyle w:val="a3"/>
-        <w:numPr>
-          <w:ilvl w:val="0"/>
-          <w:numId w:val="10"/>
-        </w:numPr>
-        <w:spacing w:line="320" w:lineRule="exact"/>
-        <w:ind w:left="357" w:firstLineChars="0" w:hanging="357"/>
-        <w:rPr>
-          <w:rFonts w:ascii="Calibri" w:eastAsia="华文细黑" w:hAnsi="Calibri" w:cs="Calibri"/>
-          <w:color w:val="404040" w:themeColor="text1" w:themeTint="BF"/>
-          <w:szCs w:val="21"/>
-        </w:rPr>
-      </w:pPr>
-      <w:r>
-        <w:rPr>
-          <w:rFonts w:ascii="Calibri" w:eastAsia="华文细黑" w:hAnsi="Calibri" w:cs="Calibri"/>
-          <w:color w:val="404040" w:themeColor="text1" w:themeTint="BF"/>
-          <w:szCs w:val="21"/>
-        </w:rPr>
-        <w:t>有分类和目标识别模型训练经验</w:t>
-      </w:r>
-      <w:r>
-        <w:rPr>
-          <w:rFonts w:ascii="Calibri" w:eastAsia="华文细黑" w:hAnsi="Calibri" w:cs="Calibri" w:hint="eastAsia"/>
-          <w:color w:val="404040" w:themeColor="text1" w:themeTint="BF"/>
-          <w:szCs w:val="21"/>
-        </w:rPr>
-        <w:t>和</w:t>
-      </w:r>
-      <w:r>
-        <w:rPr>
-          <w:rFonts w:ascii="Calibri" w:eastAsia="华文细黑" w:hAnsi="Calibri" w:cs="Calibri" w:hint="eastAsia"/>
-          <w:color w:val="404040" w:themeColor="text1" w:themeTint="BF"/>
-          <w:szCs w:val="21"/>
-        </w:rPr>
-        <w:t>AI</w:t>
-      </w:r>
-      <w:r>
-        <w:rPr>
-          <w:rFonts w:ascii="Calibri" w:eastAsia="华文细黑" w:hAnsi="Calibri" w:cs="Calibri"/>
-          <w:color w:val="404040" w:themeColor="text1" w:themeTint="BF"/>
-          <w:szCs w:val="21"/>
-        </w:rPr>
-        <w:t>大模型应用开发经验</w:t>
-      </w:r>
-      <w:r>
-        <w:rPr>
-          <w:rFonts w:ascii="Calibri" w:eastAsia="华文细黑" w:hAnsi="Calibri" w:cs="Calibri" w:hint="eastAsia"/>
-          <w:color w:val="404040" w:themeColor="text1" w:themeTint="BF"/>
-          <w:szCs w:val="21"/>
-        </w:rPr>
-        <w:t>，了解深度学习和大模型基本原理</w:t>
-      </w:r>
-    </w:p>
-    <w:p>
-      <w:pPr>
-        <w:pStyle w:val="a3"/>
-        <w:numPr>
-          <w:ilvl w:val="0"/>
-          <w:numId w:val="10"/>
-        </w:numPr>
-        <w:spacing w:line="320" w:lineRule="exact"/>
-        <w:ind w:left="357" w:firstLineChars="0" w:hanging="357"/>
-        <w:rPr>
-          <w:rFonts w:ascii="Calibri" w:eastAsia="华文细黑" w:hAnsi="Calibri" w:cs="Calibri" w:hint="eastAsia"/>
-          <w:color w:val="404040" w:themeColor="text1" w:themeTint="BF"/>
-          <w:szCs w:val="21"/>
-        </w:rPr>
-      </w:pPr>
-      <w:r>
-        <w:rPr>
-          <w:rFonts w:ascii="Calibri" w:eastAsia="华文细黑" w:hAnsi="Calibri" w:cs="Calibri" w:hint="eastAsia"/>
-          <w:color w:val="404040" w:themeColor="text1" w:themeTint="BF"/>
-          <w:szCs w:val="21"/>
-        </w:rPr>
-        <w:t>熟练使用</w:t>
-      </w:r>
-      <w:r>
-        <w:rPr>
-          <w:rFonts w:ascii="Calibri" w:eastAsia="华文细黑" w:hAnsi="Calibri" w:cs="Calibri"/>
-          <w:color w:val="404040" w:themeColor="text1" w:themeTint="BF"/>
-          <w:szCs w:val="21"/>
-        </w:rPr>
-        <w:t>AI</w:t>
-      </w:r>
-      <w:r>
-        <w:rPr>
-          <w:rFonts w:ascii="Calibri" w:eastAsia="华文细黑" w:hAnsi="Calibri" w:cs="Calibri" w:hint="eastAsia"/>
-          <w:color w:val="404040" w:themeColor="text1" w:themeTint="BF"/>
-          <w:szCs w:val="21"/>
-        </w:rPr>
-        <w:t xml:space="preserve"> C</w:t>
-      </w:r>
-      <w:r>
-        <w:rPr>
-          <w:rFonts w:ascii="Calibri" w:eastAsia="华文细黑" w:hAnsi="Calibri" w:cs="Calibri"/>
-          <w:color w:val="404040" w:themeColor="text1" w:themeTint="BF"/>
-          <w:szCs w:val="21"/>
-        </w:rPr>
-        <w:t>o</w:t>
-      </w:r>
-      <w:r>
-        <w:rPr>
-          <w:rFonts w:ascii="Calibri" w:eastAsia="华文细黑" w:hAnsi="Calibri" w:cs="Calibri" w:hint="eastAsia"/>
-          <w:color w:val="404040" w:themeColor="text1" w:themeTint="BF"/>
-          <w:szCs w:val="21"/>
-        </w:rPr>
-        <w:t>d</w:t>
-      </w:r>
-      <w:r>
-        <w:rPr>
-          <w:rFonts w:ascii="Calibri" w:eastAsia="华文细黑" w:hAnsi="Calibri" w:cs="Calibri"/>
-          <w:color w:val="404040" w:themeColor="text1" w:themeTint="BF"/>
-          <w:szCs w:val="21"/>
-        </w:rPr>
-        <w:t>ing</w:t>
-      </w:r>
-      <w:r>
-        <w:rPr>
-          <w:rFonts w:ascii="Calibri" w:eastAsia="华文细黑" w:hAnsi="Calibri" w:cs="Calibri" w:hint="eastAsia"/>
-          <w:color w:val="404040" w:themeColor="text1" w:themeTint="BF"/>
-          <w:szCs w:val="21"/>
-        </w:rPr>
-        <w:t>工具，了解</w:t>
-      </w:r>
-      <w:r>
-        <w:rPr>
-          <w:rFonts w:ascii="Calibri" w:eastAsia="华文细黑" w:hAnsi="Calibri" w:cs="Calibri" w:hint="eastAsia"/>
-          <w:color w:val="404040" w:themeColor="text1" w:themeTint="BF"/>
-          <w:szCs w:val="21"/>
-        </w:rPr>
-        <w:t>AI</w:t>
-      </w:r>
-      <w:r>
-        <w:rPr>
-          <w:rFonts w:ascii="Calibri" w:eastAsia="华文细黑" w:hAnsi="Calibri" w:cs="Calibri" w:hint="eastAsia"/>
-          <w:color w:val="404040" w:themeColor="text1" w:themeTint="BF"/>
-          <w:szCs w:val="21"/>
-        </w:rPr>
-        <w:t>编程工具的基础原理和开发流程优化</w:t>
+        <w:spacing w:line="300" w:lineRule="exact"/>
+        <w:ind w:left="442" w:firstLineChars="0" w:hanging="442"/>
+        <w:rPr>
+          <w:rFonts w:ascii="Calibri" w:eastAsia="华文细黑" w:hAnsi="Calibri" w:cs="Calibri" w:hint="eastAsia"/>
+          <w:color w:val="404040" w:themeColor="text1" w:themeTint="BF"/>
+          <w:szCs w:val="21"/>
+        </w:rPr>
+      </w:pPr>
+      <w:r>
+        <w:rPr>
+          <w:rFonts w:ascii="Calibri" w:eastAsia="华文细黑" w:hAnsi="Calibri" w:cs="Calibri"/>
+          <w:b/>
+          <w:bCs/>
+          <w:color w:val="404040" w:themeColor="text1" w:themeTint="BF"/>
+          <w:szCs w:val="21"/>
+        </w:rPr>
+        <w:t>团队管理：</w:t>
+      </w:r>
+      <w:r>
+        <w:rPr>
+          <w:rFonts w:ascii="Calibri" w:eastAsia="华文细黑" w:hAnsi="Calibri" w:cs="Calibri"/>
+          <w:color w:val="404040" w:themeColor="text1" w:themeTint="BF"/>
+          <w:szCs w:val="21"/>
+        </w:rPr>
+        <w:t>有良好的团队沟通能力及应用的任务拆解和交付能力，保障应用的交付质量。具备团队的组织运作、能力建设的能力。</w:t>
       </w:r>
     </w:p>
     <w:p>
@@ -1794,7 +1647,7 @@
               </wp:anchor>
             </w:drawing>
           </mc:Choice>
-          <mc:Fallback>
+          <mc:Fallback xmlns:w16cei="http://schemas.microsoft.com/office/word/2026/wordml/cei">
             <w:pict>
               <v:line w14:anchorId="6AB316B5" id="直接连接符 29" o:spid="_x0000_s1026" style="position:absolute;z-index:251665408;visibility:visible;mso-wrap-style:square;mso-width-percent:0;mso-height-percent:0;mso-wrap-distance-left:9pt;mso-wrap-distance-top:0;mso-wrap-distance-right:9pt;mso-wrap-distance-bottom:0;mso-position-horizontal:absolute;mso-position-horizontal-relative:text;mso-position-vertical:absolute;mso-position-vertical-relative:text;mso-width-percent:0;mso-height-percent:0;mso-width-relative:margin;mso-height-relative:margin" from="55.75pt,9.75pt" to="418.2pt,9.75pt" o:gfxdata="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" strokecolor="gray [1629]" strokeweight="2.25pt">
                 <v:stroke joinstyle="miter"/>
@@ -1874,7 +1727,7 @@
               </wp:anchor>
             </w:drawing>
           </mc:Choice>
-          <mc:Fallback>
+          <mc:Fallback xmlns:w16cei="http://schemas.microsoft.com/office/word/2026/wordml/cei">
             <w:pict>
               <v:line w14:anchorId="3869A264" id="直接连接符 28" o:spid="_x0000_s1026" style="position:absolute;z-index:251666432;visibility:visible;mso-wrap-style:square;mso-width-percent:0;mso-height-percent:0;mso-wrap-distance-left:9pt;mso-wrap-distance-top:0;mso-wrap-distance-right:9pt;mso-wrap-distance-bottom:0;mso-position-horizontal:absolute;mso-position-horizontal-relative:text;mso-position-vertical:absolute;mso-position-vertical-relative:text;mso-width-percent:0;mso-height-percent:0;mso-width-relative:margin;mso-height-relative:margin" from="0,9.75pt" to="55.65pt,9.75pt" o:gfxdata="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" strokecolor="#53aba1" strokeweight="2.25pt">
                 <v:stroke joinstyle="miter"/>
@@ -2312,6 +2165,7 @@
         </w:rPr>
         <w:t>、</w:t>
       </w:r>
+      <w:proofErr w:type="spellStart"/>
       <w:r>
         <w:rPr>
           <w:rFonts w:ascii="Calibri" w:eastAsia="华文细黑" w:hAnsi="Calibri" w:cs="Calibri" w:hint="eastAsia"/>
@@ -2320,6 +2174,7 @@
         </w:rPr>
         <w:t>MagicOS</w:t>
       </w:r>
+      <w:proofErr w:type="spellEnd"/>
       <w:r>
         <w:rPr>
           <w:rFonts w:ascii="Calibri" w:eastAsia="华文细黑" w:hAnsi="Calibri" w:cs="Calibri" w:hint="eastAsia"/>
@@ -2438,6 +2293,7 @@
           <w:color w:val="404040" w:themeColor="text1" w:themeTint="BF"/>
           <w:szCs w:val="21"/>
         </w:rPr>
+        <w:lastRenderedPageBreak/>
         <w:t>我负责开发的代码参与公司级代码评比获得金码奖</w:t>
       </w:r>
       <w:r>
@@ -2470,7 +2326,6 @@
           <w:color w:val="404040" w:themeColor="text1" w:themeTint="BF"/>
           <w:szCs w:val="21"/>
         </w:rPr>
-        <w:lastRenderedPageBreak/>
         <w:t>120</w:t>
       </w:r>
       <w:r>
@@ -2537,6 +2392,7 @@
         </w:rPr>
         <w:t>、研发管理部、云服务部门的荣耀商城、亲选商城、内购商城、运动健康、</w:t>
       </w:r>
+      <w:proofErr w:type="spellStart"/>
       <w:r>
         <w:rPr>
           <w:rFonts w:ascii="Calibri" w:eastAsia="华文细黑" w:hAnsi="Calibri" w:cs="Calibri" w:hint="eastAsia"/>
@@ -2545,6 +2401,7 @@
         </w:rPr>
         <w:t>MyHonor</w:t>
       </w:r>
+      <w:proofErr w:type="spellEnd"/>
       <w:r>
         <w:rPr>
           <w:rFonts w:ascii="Calibri" w:eastAsia="华文细黑" w:hAnsi="Calibri" w:cs="Calibri" w:hint="eastAsia"/>
@@ -2817,7 +2674,25 @@
           <w:color w:val="404040" w:themeColor="text1" w:themeTint="BF"/>
           <w:szCs w:val="21"/>
         </w:rPr>
-        <w:t xml:space="preserve"> SpringCloud </w:t>
+        <w:t xml:space="preserve"> </w:t>
+      </w:r>
+      <w:proofErr w:type="spellStart"/>
+      <w:r>
+        <w:rPr>
+          <w:rFonts w:ascii="Calibri" w:eastAsia="华文细黑" w:hAnsi="Calibri" w:cs="Calibri"/>
+          <w:color w:val="404040" w:themeColor="text1" w:themeTint="BF"/>
+          <w:szCs w:val="21"/>
+        </w:rPr>
+        <w:t>SpringCloud</w:t>
+      </w:r>
+      <w:proofErr w:type="spellEnd"/>
+      <w:r>
+        <w:rPr>
+          <w:rFonts w:ascii="Calibri" w:eastAsia="华文细黑" w:hAnsi="Calibri" w:cs="Calibri"/>
+          <w:color w:val="404040" w:themeColor="text1" w:themeTint="BF"/>
+          <w:szCs w:val="21"/>
+        </w:rPr>
+        <w:t xml:space="preserve"> </w:t>
       </w:r>
       <w:r>
         <w:rPr>
@@ -3106,6 +2981,7 @@
         </w:rPr>
         <w:t>负责交易风控引擎应用的方案设计，基于</w:t>
       </w:r>
+      <w:proofErr w:type="spellStart"/>
       <w:r>
         <w:rPr>
           <w:rFonts w:ascii="Calibri" w:eastAsia="华文细黑" w:hAnsi="Calibri" w:cs="Calibri" w:hint="eastAsia"/>
@@ -3114,6 +2990,7 @@
         </w:rPr>
         <w:t>springboot</w:t>
       </w:r>
+      <w:proofErr w:type="spellEnd"/>
       <w:r>
         <w:rPr>
           <w:rFonts w:ascii="Calibri" w:eastAsia="华文细黑" w:hAnsi="Calibri" w:cs="Calibri" w:hint="eastAsia"/>
@@ -3122,6 +2999,7 @@
         </w:rPr>
         <w:t>、</w:t>
       </w:r>
+      <w:proofErr w:type="spellStart"/>
       <w:r>
         <w:rPr>
           <w:rFonts w:ascii="Calibri" w:eastAsia="华文细黑" w:hAnsi="Calibri" w:cs="Calibri" w:hint="eastAsia"/>
@@ -3130,6 +3008,7 @@
         </w:rPr>
         <w:t>dubbo</w:t>
       </w:r>
+      <w:proofErr w:type="spellEnd"/>
       <w:r>
         <w:rPr>
           <w:rFonts w:ascii="Calibri" w:eastAsia="华文细黑" w:hAnsi="Calibri" w:cs="Calibri" w:hint="eastAsia"/>
@@ -3312,7 +3191,7 @@
         <w:spacing w:line="320" w:lineRule="exact"/>
         <w:ind w:firstLine="420"/>
         <w:rPr>
-          <w:rFonts w:ascii="Calibri" w:eastAsia="华文细黑" w:hAnsi="Calibri" w:cs="Calibri" w:hint="eastAsia"/>
+          <w:rFonts w:ascii="Calibri" w:eastAsia="华文细黑" w:hAnsi="Calibri" w:cs="Calibri"/>
           <w:color w:val="404040" w:themeColor="text1" w:themeTint="BF"/>
           <w:szCs w:val="21"/>
         </w:rPr>
@@ -3447,7 +3326,7 @@
         <w:spacing w:line="320" w:lineRule="exact"/>
         <w:ind w:firstLine="420"/>
         <w:rPr>
-          <w:rFonts w:ascii="Calibri" w:eastAsia="华文细黑" w:hAnsi="Calibri" w:cs="Calibri" w:hint="eastAsia"/>
+          <w:rFonts w:ascii="Calibri" w:eastAsia="华文细黑" w:hAnsi="Calibri" w:cs="Calibri"/>
           <w:color w:val="404040" w:themeColor="text1" w:themeTint="BF"/>
           <w:szCs w:val="21"/>
         </w:rPr>
@@ -3702,6 +3581,7 @@
           <w:color w:val="404040" w:themeColor="text1" w:themeTint="BF"/>
           <w:szCs w:val="21"/>
         </w:rPr>
+        <w:lastRenderedPageBreak/>
         <w:t>工作</w:t>
       </w:r>
       <w:r>
@@ -3746,7 +3626,6 @@
           <w:color w:val="404040" w:themeColor="text1" w:themeTint="BF"/>
           <w:szCs w:val="21"/>
         </w:rPr>
-        <w:lastRenderedPageBreak/>
         <w:t>参与魔聘系统方案设计，</w:t>
       </w:r>
       <w:r>
@@ -3795,7 +3674,16 @@
           <w:color w:val="404040" w:themeColor="text1" w:themeTint="BF"/>
           <w:szCs w:val="21"/>
         </w:rPr>
-        <w:t>负责兼职业务在线赚钱任务标签体系搭建</w:t>
+        <w:t>负责兼职业务在线赚钱任务标签体系</w:t>
+      </w:r>
+      <w:proofErr w:type="gramStart"/>
+      <w:r>
+        <w:rPr>
+          <w:rFonts w:ascii="Calibri" w:eastAsia="华文细黑" w:hAnsi="Calibri" w:cs="Calibri" w:hint="eastAsia"/>
+          <w:color w:val="404040" w:themeColor="text1" w:themeTint="BF"/>
+          <w:szCs w:val="21"/>
+        </w:rPr>
+        <w:t>搭建</w:t>
       </w:r>
       <w:r>
         <w:rPr>
@@ -3805,6 +3693,7 @@
         </w:rPr>
         <w:t>,</w:t>
       </w:r>
+      <w:proofErr w:type="gramEnd"/>
       <w:r>
         <w:rPr>
           <w:rFonts w:ascii="Calibri" w:eastAsia="华文细黑" w:hAnsi="Calibri" w:cs="Calibri" w:hint="eastAsia"/>
@@ -4402,6 +4291,7 @@
         </w:rPr>
         <w:t>任务将计算标签写入</w:t>
       </w:r>
+      <w:proofErr w:type="spellStart"/>
       <w:r>
         <w:rPr>
           <w:rFonts w:ascii="Calibri" w:eastAsia="华文细黑" w:hAnsi="Calibri" w:cs="Calibri" w:hint="eastAsia"/>
@@ -4410,6 +4300,7 @@
         </w:rPr>
         <w:t>redis</w:t>
       </w:r>
+      <w:proofErr w:type="spellEnd"/>
       <w:r>
         <w:rPr>
           <w:rFonts w:ascii="Calibri" w:eastAsia="华文细黑" w:hAnsi="Calibri" w:cs="Calibri" w:hint="eastAsia"/>
@@ -4442,6 +4333,7 @@
         </w:rPr>
         <w:t>开发标签服务，从</w:t>
       </w:r>
+      <w:proofErr w:type="spellStart"/>
       <w:r>
         <w:rPr>
           <w:rFonts w:ascii="Calibri" w:eastAsia="华文细黑" w:hAnsi="Calibri" w:cs="Calibri" w:hint="eastAsia"/>
@@ -4450,6 +4342,7 @@
         </w:rPr>
         <w:t>redis</w:t>
       </w:r>
+      <w:proofErr w:type="spellEnd"/>
       <w:r>
         <w:rPr>
           <w:rFonts w:ascii="Calibri" w:eastAsia="华文细黑" w:hAnsi="Calibri" w:cs="Calibri" w:hint="eastAsia"/>
@@ -5700,6 +5593,7 @@
           <w:color w:val="404040" w:themeColor="text1" w:themeTint="BF"/>
           <w:szCs w:val="21"/>
         </w:rPr>
+        <w:lastRenderedPageBreak/>
         <w:t>四方精创</w:t>
       </w:r>
       <w:r>
@@ -5896,7 +5790,6 @@
           <w:color w:val="404040" w:themeColor="text1" w:themeTint="BF"/>
           <w:szCs w:val="21"/>
         </w:rPr>
-        <w:lastRenderedPageBreak/>
         <w:t>工作描述：</w:t>
       </w:r>
     </w:p>
@@ -6231,7 +6124,7 @@
 </file>
 
 <file path=word/endnotes.xml><?xml version="1.0" encoding="utf-8"?>
-<w:endnotes xmlns:wpc="http://schemas.microsoft.com/office/word/2010/wordprocessingCanvas" xmlns:cx="http://schemas.microsoft.com/office/drawing/2014/chartex" xmlns:cx1="http://schemas.microsoft.com/office/drawing/2015/9/8/chartex" xmlns:cx2="http://schemas.microsoft.com/office/drawing/2015/10/21/chartex" xmlns:cx3="http://schemas.microsoft.com/office/drawing/2016/5/9/chartex" xmlns:cx4="http://schemas.microsoft.com/office/drawing/2016/5/10/chartex" xmlns:cx5="http://schemas.microsoft.com/office/drawing/2016/5/11/chartex" xmlns:cx6="http://schemas.microsoft.com/office/drawing/2016/5/12/chartex" xmlns:cx7="http://schemas.microsoft.com/office/drawing/2016/5/13/chartex" xmlns:cx8="http://schemas.microsoft.com/office/drawing/2016/5/14/chartex" xmlns:mc="http://schemas.openxmlformats.org/markup-compatibility/2006" xmlns:aink="http://schemas.microsoft.com/office/drawing/2016/ink" xmlns:am3d="http://schemas.microsoft.com/office/drawing/2017/model3d" xmlns:o="urn:schemas-microsoft-com:office:office" xmlns:oel="http://schemas.microsoft.com/office/2019/extlst" xmlns:r="http://schemas.openxmlformats.org/officeDocument/2006/relationships" xmlns:m="http://schemas.openxmlformats.org/officeDocument/2006/math" xmlns:v="urn:schemas-microsoft-com:vml" xmlns:wp14="http://schemas.microsoft.com/office/word/2010/wordprocessingDrawing" xmlns:wp="http://schemas.openxmlformats.org/drawingml/2006/wordprocessingDrawing" xmlns:w10="urn:schemas-microsoft-com:office:word" xmlns:w="http://schemas.openxmlformats.org/wordprocessingml/2006/main" xmlns:w14="http://schemas.microsoft.com/office/word/2010/wordml" xmlns:w15="http://schemas.microsoft.com/office/word/2012/wordml" xmlns:w16cei="http://schemas.microsoft.com/office/word/2026/wordml/cei" xmlns:w16cex="http://schemas.microsoft.com/office/word/2018/wordml/cex" xmlns:w16cid="http://schemas.microsoft.com/office/word/2016/wordml/cid" xmlns:w16="http://schemas.microsoft.com/office/word/2018/wordml" xmlns:w16du="http://schemas.microsoft.com/office/word/2023/wordml/word16du" xmlns:w16sdtdh="http://schemas.microsoft.com/office/word/2020/wordml/sdtdatahash" xmlns:w16sdtfl="http://schemas.microsoft.com/office/word/2024/wordml/sdtformatlock" xmlns:w16se="http://schemas.microsoft.com/office/word/2015/wordml/symex" xmlns:wpg="http://schemas.microsoft.com/office/word/2010/wordprocessingGroup" xmlns:wpi="http://schemas.microsoft.com/office/word/2010/wordprocessingInk" xmlns:wne="http://schemas.microsoft.com/office/word/2006/wordml" xmlns:wps="http://schemas.microsoft.com/office/word/2010/wordprocessingShape" mc:Ignorable="w14 w15 w16se w16cid w16 w16cex w16sdtdh w16sdtfl w16du wp14">
+<w:endnotes xmlns:wpc="http://schemas.microsoft.com/office/word/2010/wordprocessingCanvas" xmlns:cx="http://schemas.microsoft.com/office/drawing/2014/chartex" xmlns:cx1="http://schemas.microsoft.com/office/drawing/2015/9/8/chartex" xmlns:cx2="http://schemas.microsoft.com/office/drawing/2015/10/21/chartex" xmlns:cx3="http://schemas.microsoft.com/office/drawing/2016/5/9/chartex" xmlns:cx4="http://schemas.microsoft.com/office/drawing/2016/5/10/chartex" xmlns:cx5="http://schemas.microsoft.com/office/drawing/2016/5/11/chartex" xmlns:cx6="http://schemas.microsoft.com/office/drawing/2016/5/12/chartex" xmlns:cx7="http://schemas.microsoft.com/office/drawing/2016/5/13/chartex" xmlns:cx8="http://schemas.microsoft.com/office/drawing/2016/5/14/chartex" xmlns:mc="http://schemas.openxmlformats.org/markup-compatibility/2006" xmlns:aink="http://schemas.microsoft.com/office/drawing/2016/ink" xmlns:am3d="http://schemas.microsoft.com/office/drawing/2017/model3d" xmlns:o="urn:schemas-microsoft-com:office:office" xmlns:oel="http://schemas.microsoft.com/office/2019/extlst" xmlns:r="http://schemas.openxmlformats.org/officeDocument/2006/relationships" xmlns:m="http://schemas.openxmlformats.org/officeDocument/2006/math" xmlns:v="urn:schemas-microsoft-com:vml" xmlns:wp14="http://schemas.microsoft.com/office/word/2010/wordprocessingDrawing" xmlns:wp="http://schemas.openxmlformats.org/drawingml/2006/wordprocessingDrawing" xmlns:w10="urn:schemas-microsoft-com:office:word" xmlns:w="http://schemas.openxmlformats.org/wordprocessingml/2006/main" xmlns:w14="http://schemas.microsoft.com/office/word/2010/wordml" xmlns:w15="http://schemas.microsoft.com/office/word/2012/wordml" xmlns:w16cex="http://schemas.microsoft.com/office/word/2018/wordml/cex" xmlns:w16cid="http://schemas.microsoft.com/office/word/2016/wordml/cid" xmlns:w16="http://schemas.microsoft.com/office/word/2018/wordml" xmlns:w16du="http://schemas.microsoft.com/office/word/2023/wordml/word16du" xmlns:w16sdtdh="http://schemas.microsoft.com/office/word/2020/wordml/sdtdatahash" xmlns:w16sdtfl="http://schemas.microsoft.com/office/word/2024/wordml/sdtformatlock" xmlns:w16se="http://schemas.microsoft.com/office/word/2015/wordml/symex" xmlns:wpg="http://schemas.microsoft.com/office/word/2010/wordprocessingGroup" xmlns:wpi="http://schemas.microsoft.com/office/word/2010/wordprocessingInk" xmlns:wne="http://schemas.microsoft.com/office/word/2006/wordml" xmlns:wps="http://schemas.microsoft.com/office/word/2010/wordprocessingShape" mc:Ignorable="w14 w15 w16se w16cid w16 w16cex w16sdtdh w16sdtfl w16du wp14">
   <w:endnote w:type="separator" w:id="-1">
     <w:p>
       <w:pPr>
@@ -6260,7 +6153,7 @@
 </file>
 
 <file path=word/footnotes.xml><?xml version="1.0" encoding="utf-8"?>
-<w:footnotes xmlns:wpc="http://schemas.microsoft.com/office/word/2010/wordprocessingCanvas" xmlns:cx="http://schemas.microsoft.com/office/drawing/2014/chartex" xmlns:cx1="http://schemas.microsoft.com/office/drawing/2015/9/8/chartex" xmlns:cx2="http://schemas.microsoft.com/office/drawing/2015/10/21/chartex" xmlns:cx3="http://schemas.microsoft.com/office/drawing/2016/5/9/chartex" xmlns:cx4="http://schemas.microsoft.com/office/drawing/2016/5/10/chartex" xmlns:cx5="http://schemas.microsoft.com/office/drawing/2016/5/11/chartex" xmlns:cx6="http://schemas.microsoft.com/office/drawing/2016/5/12/chartex" xmlns:cx7="http://schemas.microsoft.com/office/drawing/2016/5/13/chartex" xmlns:cx8="http://schemas.microsoft.com/office/drawing/2016/5/14/chartex" xmlns:mc="http://schemas.openxmlformats.org/markup-compatibility/2006" xmlns:aink="http://schemas.microsoft.com/office/drawing/2016/ink" xmlns:am3d="http://schemas.microsoft.com/office/drawing/2017/model3d" xmlns:o="urn:schemas-microsoft-com:office:office" xmlns:oel="http://schemas.microsoft.com/office/2019/extlst" xmlns:r="http://schemas.openxmlformats.org/officeDocument/2006/relationships" xmlns:m="http://schemas.openxmlformats.org/officeDocument/2006/math" xmlns:v="urn:schemas-microsoft-com:vml" xmlns:wp14="http://schemas.microsoft.com/office/word/2010/wordprocessingDrawing" xmlns:wp="http://schemas.openxmlformats.org/drawingml/2006/wordprocessingDrawing" xmlns:w10="urn:schemas-microsoft-com:office:word" xmlns:w="http://schemas.openxmlformats.org/wordprocessingml/2006/main" xmlns:w14="http://schemas.microsoft.com/office/word/2010/wordml" xmlns:w15="http://schemas.microsoft.com/office/word/2012/wordml" xmlns:w16cei="http://schemas.microsoft.com/office/word/2026/wordml/cei" xmlns:w16cex="http://schemas.microsoft.com/office/word/2018/wordml/cex" xmlns:w16cid="http://schemas.microsoft.com/office/word/2016/wordml/cid" xmlns:w16="http://schemas.microsoft.com/office/word/2018/wordml" xmlns:w16du="http://schemas.microsoft.com/office/word/2023/wordml/word16du" xmlns:w16sdtdh="http://schemas.microsoft.com/office/word/2020/wordml/sdtdatahash" xmlns:w16sdtfl="http://schemas.microsoft.com/office/word/2024/wordml/sdtformatlock" xmlns:w16se="http://schemas.microsoft.com/office/word/2015/wordml/symex" xmlns:wpg="http://schemas.microsoft.com/office/word/2010/wordprocessingGroup" xmlns:wpi="http://schemas.microsoft.com/office/word/2010/wordprocessingInk" xmlns:wne="http://schemas.microsoft.com/office/word/2006/wordml" xmlns:wps="http://schemas.microsoft.com/office/word/2010/wordprocessingShape" mc:Ignorable="w14 w15 w16se w16cid w16 w16cex w16sdtdh w16sdtfl w16du wp14">
+<w:footnotes xmlns:wpc="http://schemas.microsoft.com/office/word/2010/wordprocessingCanvas" xmlns:cx="http://schemas.microsoft.com/office/drawing/2014/chartex" xmlns:cx1="http://schemas.microsoft.com/office/drawing/2015/9/8/chartex" xmlns:cx2="http://schemas.microsoft.com/office/drawing/2015/10/21/chartex" xmlns:cx3="http://schemas.microsoft.com/office/drawing/2016/5/9/chartex" xmlns:cx4="http://schemas.microsoft.com/office/drawing/2016/5/10/chartex" xmlns:cx5="http://schemas.microsoft.com/office/drawing/2016/5/11/chartex" xmlns:cx6="http://schemas.microsoft.com/office/drawing/2016/5/12/chartex" xmlns:cx7="http://schemas.microsoft.com/office/drawing/2016/5/13/chartex" xmlns:cx8="http://schemas.microsoft.com/office/drawing/2016/5/14/chartex" xmlns:mc="http://schemas.openxmlformats.org/markup-compatibility/2006" xmlns:aink="http://schemas.microsoft.com/office/drawing/2016/ink" xmlns:am3d="http://schemas.microsoft.com/office/drawing/2017/model3d" xmlns:o="urn:schemas-microsoft-com:office:office" xmlns:oel="http://schemas.microsoft.com/office/2019/extlst" xmlns:r="http://schemas.openxmlformats.org/officeDocument/2006/relationships" xmlns:m="http://schemas.openxmlformats.org/officeDocument/2006/math" xmlns:v="urn:schemas-microsoft-com:vml" xmlns:wp14="http://schemas.microsoft.com/office/word/2010/wordprocessingDrawing" xmlns:wp="http://schemas.openxmlformats.org/drawingml/2006/wordprocessingDrawing" xmlns:w10="urn:schemas-microsoft-com:office:word" xmlns:w="http://schemas.openxmlformats.org/wordprocessingml/2006/main" xmlns:w14="http://schemas.microsoft.com/office/word/2010/wordml" xmlns:w15="http://schemas.microsoft.com/office/word/2012/wordml" xmlns:w16cex="http://schemas.microsoft.com/office/word/2018/wordml/cex" xmlns:w16cid="http://schemas.microsoft.com/office/word/2016/wordml/cid" xmlns:w16="http://schemas.microsoft.com/office/word/2018/wordml" xmlns:w16du="http://schemas.microsoft.com/office/word/2023/wordml/word16du" xmlns:w16sdtdh="http://schemas.microsoft.com/office/word/2020/wordml/sdtdatahash" xmlns:w16sdtfl="http://schemas.microsoft.com/office/word/2024/wordml/sdtformatlock" xmlns:w16se="http://schemas.microsoft.com/office/word/2015/wordml/symex" xmlns:wpg="http://schemas.microsoft.com/office/word/2010/wordprocessingGroup" xmlns:wpi="http://schemas.microsoft.com/office/word/2010/wordprocessingInk" xmlns:wne="http://schemas.microsoft.com/office/word/2006/wordml" xmlns:wps="http://schemas.microsoft.com/office/word/2010/wordprocessingShape" mc:Ignorable="w14 w15 w16se w16cid w16 w16cex w16sdtdh w16sdtfl w16du wp14">
   <w:footnote w:type="separator" w:id="-1">
     <w:p>
       <w:pPr>
@@ -6289,7 +6182,7 @@
 </file>
 
 <file path=word/header1.xml><?xml version="1.0" encoding="utf-8"?>
-<w:hdr xmlns:wpc="http://schemas.microsoft.com/office/word/2010/wordprocessingCanvas" xmlns:cx="http://schemas.microsoft.com/office/drawing/2014/chartex" xmlns:cx1="http://schemas.microsoft.com/office/drawing/2015/9/8/chartex" xmlns:cx2="http://schemas.microsoft.com/office/drawing/2015/10/21/chartex" xmlns:cx3="http://schemas.microsoft.com/office/drawing/2016/5/9/chartex" xmlns:cx4="http://schemas.microsoft.com/office/drawing/2016/5/10/chartex" xmlns:cx5="http://schemas.microsoft.com/office/drawing/2016/5/11/chartex" xmlns:cx6="http://schemas.microsoft.com/office/drawing/2016/5/12/chartex" xmlns:cx7="http://schemas.microsoft.com/office/drawing/2016/5/13/chartex" xmlns:cx8="http://schemas.microsoft.com/office/drawing/2016/5/14/chartex" xmlns:mc="http://schemas.openxmlformats.org/markup-compatibility/2006" xmlns:aink="http://schemas.microsoft.com/office/drawing/2016/ink" xmlns:am3d="http://schemas.microsoft.com/office/drawing/2017/model3d" xmlns:o="urn:schemas-microsoft-com:office:office" xmlns:oel="http://schemas.microsoft.com/office/2019/extlst" xmlns:r="http://schemas.openxmlformats.org/officeDocument/2006/relationships" xmlns:m="http://schemas.openxmlformats.org/officeDocument/2006/math" xmlns:v="urn:schemas-microsoft-com:vml" xmlns:wp14="http://schemas.microsoft.com/office/word/2010/wordprocessingDrawing" xmlns:wp="http://schemas.openxmlformats.org/drawingml/2006/wordprocessingDrawing" xmlns:w10="urn:schemas-microsoft-com:office:word" xmlns:w="http://schemas.openxmlformats.org/wordprocessingml/2006/main" xmlns:w14="http://schemas.microsoft.com/office/word/2010/wordml" xmlns:w15="http://schemas.microsoft.com/office/word/2012/wordml" xmlns:w16cei="http://schemas.microsoft.com/office/word/2026/wordml/cei" xmlns:w16cex="http://schemas.microsoft.com/office/word/2018/wordml/cex" xmlns:w16cid="http://schemas.microsoft.com/office/word/2016/wordml/cid" xmlns:w16="http://schemas.microsoft.com/office/word/2018/wordml" xmlns:w16du="http://schemas.microsoft.com/office/word/2023/wordml/word16du" xmlns:w16sdtdh="http://schemas.microsoft.com/office/word/2020/wordml/sdtdatahash" xmlns:w16sdtfl="http://schemas.microsoft.com/office/word/2024/wordml/sdtformatlock" xmlns:w16se="http://schemas.microsoft.com/office/word/2015/wordml/symex" xmlns:wpg="http://schemas.microsoft.com/office/word/2010/wordprocessingGroup" xmlns:wpi="http://schemas.microsoft.com/office/word/2010/wordprocessingInk" xmlns:wne="http://schemas.microsoft.com/office/word/2006/wordml" xmlns:wps="http://schemas.microsoft.com/office/word/2010/wordprocessingShape" mc:Ignorable="w14 w15 w16se w16cid w16 w16cex w16sdtdh w16sdtfl w16du wp14">
+<w:hdr xmlns:wpc="http://schemas.microsoft.com/office/word/2010/wordprocessingCanvas" xmlns:cx="http://schemas.microsoft.com/office/drawing/2014/chartex" xmlns:cx1="http://schemas.microsoft.com/office/drawing/2015/9/8/chartex" xmlns:cx2="http://schemas.microsoft.com/office/drawing/2015/10/21/chartex" xmlns:cx3="http://schemas.microsoft.com/office/drawing/2016/5/9/chartex" xmlns:cx4="http://schemas.microsoft.com/office/drawing/2016/5/10/chartex" xmlns:cx5="http://schemas.microsoft.com/office/drawing/2016/5/11/chartex" xmlns:cx6="http://schemas.microsoft.com/office/drawing/2016/5/12/chartex" xmlns:cx7="http://schemas.microsoft.com/office/drawing/2016/5/13/chartex" xmlns:cx8="http://schemas.microsoft.com/office/drawing/2016/5/14/chartex" xmlns:mc="http://schemas.openxmlformats.org/markup-compatibility/2006" xmlns:aink="http://schemas.microsoft.com/office/drawing/2016/ink" xmlns:am3d="http://schemas.microsoft.com/office/drawing/2017/model3d" xmlns:o="urn:schemas-microsoft-com:office:office" xmlns:oel="http://schemas.microsoft.com/office/2019/extlst" xmlns:r="http://schemas.openxmlformats.org/officeDocument/2006/relationships" xmlns:m="http://schemas.openxmlformats.org/officeDocument/2006/math" xmlns:v="urn:schemas-microsoft-com:vml" xmlns:wp14="http://schemas.microsoft.com/office/word/2010/wordprocessingDrawing" xmlns:wp="http://schemas.openxmlformats.org/drawingml/2006/wordprocessingDrawing" xmlns:w10="urn:schemas-microsoft-com:office:word" xmlns:w="http://schemas.openxmlformats.org/wordprocessingml/2006/main" xmlns:w14="http://schemas.microsoft.com/office/word/2010/wordml" xmlns:w15="http://schemas.microsoft.com/office/word/2012/wordml" xmlns:w16cex="http://schemas.microsoft.com/office/word/2018/wordml/cex" xmlns:w16cid="http://schemas.microsoft.com/office/word/2016/wordml/cid" xmlns:w16="http://schemas.microsoft.com/office/word/2018/wordml" xmlns:w16du="http://schemas.microsoft.com/office/word/2023/wordml/word16du" xmlns:w16sdtdh="http://schemas.microsoft.com/office/word/2020/wordml/sdtdatahash" xmlns:w16sdtfl="http://schemas.microsoft.com/office/word/2024/wordml/sdtformatlock" xmlns:w16se="http://schemas.microsoft.com/office/word/2015/wordml/symex" xmlns:wpg="http://schemas.microsoft.com/office/word/2010/wordprocessingGroup" xmlns:wpi="http://schemas.microsoft.com/office/word/2010/wordprocessingInk" xmlns:wne="http://schemas.microsoft.com/office/word/2006/wordml" xmlns:wps="http://schemas.microsoft.com/office/word/2010/wordprocessingShape" mc:Ignorable="w14 w15 w16se w16cid w16 w16cex w16sdtdh w16sdtfl w16du wp14">
   <w:p>
     <w:pPr>
       <w:pStyle w:val="a6"/>
@@ -6305,7 +6198,7 @@
 </file>
 
 <file path=word/header2.xml><?xml version="1.0" encoding="utf-8"?>
-<w:hdr xmlns:wpc="http://schemas.microsoft.com/office/word/2010/wordprocessingCanvas" xmlns:cx="http://schemas.microsoft.com/office/drawing/2014/chartex" xmlns:cx1="http://schemas.microsoft.com/office/drawing/2015/9/8/chartex" xmlns:cx2="http://schemas.microsoft.com/office/drawing/2015/10/21/chartex" xmlns:cx3="http://schemas.microsoft.com/office/drawing/2016/5/9/chartex" xmlns:cx4="http://schemas.microsoft.com/office/drawing/2016/5/10/chartex" xmlns:cx5="http://schemas.microsoft.com/office/drawing/2016/5/11/chartex" xmlns:cx6="http://schemas.microsoft.com/office/drawing/2016/5/12/chartex" xmlns:cx7="http://schemas.microsoft.com/office/drawing/2016/5/13/chartex" xmlns:cx8="http://schemas.microsoft.com/office/drawing/2016/5/14/chartex" xmlns:mc="http://schemas.openxmlformats.org/markup-compatibility/2006" xmlns:aink="http://schemas.microsoft.com/office/drawing/2016/ink" xmlns:am3d="http://schemas.microsoft.com/office/drawing/2017/model3d" xmlns:o="urn:schemas-microsoft-com:office:office" xmlns:oel="http://schemas.microsoft.com/office/2019/extlst" xmlns:r="http://schemas.openxmlformats.org/officeDocument/2006/relationships" xmlns:m="http://schemas.openxmlformats.org/officeDocument/2006/math" xmlns:v="urn:schemas-microsoft-com:vml" xmlns:wp14="http://schemas.microsoft.com/office/word/2010/wordprocessingDrawing" xmlns:wp="http://schemas.openxmlformats.org/drawingml/2006/wordprocessingDrawing" xmlns:w10="urn:schemas-microsoft-com:office:word" xmlns:w="http://schemas.openxmlformats.org/wordprocessingml/2006/main" xmlns:w14="http://schemas.microsoft.com/office/word/2010/wordml" xmlns:w15="http://schemas.microsoft.com/office/word/2012/wordml" xmlns:w16cei="http://schemas.microsoft.com/office/word/2026/wordml/cei" xmlns:w16cex="http://schemas.microsoft.com/office/word/2018/wordml/cex" xmlns:w16cid="http://schemas.microsoft.com/office/word/2016/wordml/cid" xmlns:w16="http://schemas.microsoft.com/office/word/2018/wordml" xmlns:w16du="http://schemas.microsoft.com/office/word/2023/wordml/word16du" xmlns:w16sdtdh="http://schemas.microsoft.com/office/word/2020/wordml/sdtdatahash" xmlns:w16sdtfl="http://schemas.microsoft.com/office/word/2024/wordml/sdtformatlock" xmlns:w16se="http://schemas.microsoft.com/office/word/2015/wordml/symex" xmlns:wpg="http://schemas.microsoft.com/office/word/2010/wordprocessingGroup" xmlns:wpi="http://schemas.microsoft.com/office/word/2010/wordprocessingInk" xmlns:wne="http://schemas.microsoft.com/office/word/2006/wordml" xmlns:wps="http://schemas.microsoft.com/office/word/2010/wordprocessingShape" mc:Ignorable="w14 w15 w16se w16cid w16 w16cex w16sdtdh w16sdtfl w16du wp14">
+<w:hdr xmlns:wpc="http://schemas.microsoft.com/office/word/2010/wordprocessingCanvas" xmlns:cx="http://schemas.microsoft.com/office/drawing/2014/chartex" xmlns:cx1="http://schemas.microsoft.com/office/drawing/2015/9/8/chartex" xmlns:cx2="http://schemas.microsoft.com/office/drawing/2015/10/21/chartex" xmlns:cx3="http://schemas.microsoft.com/office/drawing/2016/5/9/chartex" xmlns:cx4="http://schemas.microsoft.com/office/drawing/2016/5/10/chartex" xmlns:cx5="http://schemas.microsoft.com/office/drawing/2016/5/11/chartex" xmlns:cx6="http://schemas.microsoft.com/office/drawing/2016/5/12/chartex" xmlns:cx7="http://schemas.microsoft.com/office/drawing/2016/5/13/chartex" xmlns:cx8="http://schemas.microsoft.com/office/drawing/2016/5/14/chartex" xmlns:mc="http://schemas.openxmlformats.org/markup-compatibility/2006" xmlns:aink="http://schemas.microsoft.com/office/drawing/2016/ink" xmlns:am3d="http://schemas.microsoft.com/office/drawing/2017/model3d" xmlns:o="urn:schemas-microsoft-com:office:office" xmlns:oel="http://schemas.microsoft.com/office/2019/extlst" xmlns:r="http://schemas.openxmlformats.org/officeDocument/2006/relationships" xmlns:m="http://schemas.openxmlformats.org/officeDocument/2006/math" xmlns:v="urn:schemas-microsoft-com:vml" xmlns:wp14="http://schemas.microsoft.com/office/word/2010/wordprocessingDrawing" xmlns:wp="http://schemas.openxmlformats.org/drawingml/2006/wordprocessingDrawing" xmlns:w10="urn:schemas-microsoft-com:office:word" xmlns:w="http://schemas.openxmlformats.org/wordprocessingml/2006/main" xmlns:w14="http://schemas.microsoft.com/office/word/2010/wordml" xmlns:w15="http://schemas.microsoft.com/office/word/2012/wordml" xmlns:w16cex="http://schemas.microsoft.com/office/word/2018/wordml/cex" xmlns:w16cid="http://schemas.microsoft.com/office/word/2016/wordml/cid" xmlns:w16="http://schemas.microsoft.com/office/word/2018/wordml" xmlns:w16du="http://schemas.microsoft.com/office/word/2023/wordml/word16du" xmlns:w16sdtdh="http://schemas.microsoft.com/office/word/2020/wordml/sdtdatahash" xmlns:w16sdtfl="http://schemas.microsoft.com/office/word/2024/wordml/sdtformatlock" xmlns:w16se="http://schemas.microsoft.com/office/word/2015/wordml/symex" xmlns:wpg="http://schemas.microsoft.com/office/word/2010/wordprocessingGroup" xmlns:wpi="http://schemas.microsoft.com/office/word/2010/wordprocessingInk" xmlns:wne="http://schemas.microsoft.com/office/word/2006/wordml" xmlns:wps="http://schemas.microsoft.com/office/word/2010/wordprocessingShape" mc:Ignorable="w14 w15 w16se w16cid w16 w16cex w16sdtdh w16sdtfl w16du wp14">
   <w:p>
     <w:pPr>
       <w:pStyle w:val="a6"/>
@@ -6321,7 +6214,7 @@
 </file>
 
 <file path=word/numbering.xml><?xml version="1.0" encoding="utf-8"?>
-<w:numbering xmlns:wpc="http://schemas.microsoft.com/office/word/2010/wordprocessingCanvas" xmlns:cx="http://schemas.microsoft.com/office/drawing/2014/chartex" xmlns:cx1="http://schemas.microsoft.com/office/drawing/2015/9/8/chartex" xmlns:cx2="http://schemas.microsoft.com/office/drawing/2015/10/21/chartex" xmlns:cx3="http://schemas.microsoft.com/office/drawing/2016/5/9/chartex" xmlns:cx4="http://schemas.microsoft.com/office/drawing/2016/5/10/chartex" xmlns:cx5="http://schemas.microsoft.com/office/drawing/2016/5/11/chartex" xmlns:cx6="http://schemas.microsoft.com/office/drawing/2016/5/12/chartex" xmlns:cx7="http://schemas.microsoft.com/office/drawing/2016/5/13/chartex" xmlns:cx8="http://schemas.microsoft.com/office/drawing/2016/5/14/chartex" xmlns:mc="http://schemas.openxmlformats.org/markup-compatibility/2006" xmlns:aink="http://schemas.microsoft.com/office/drawing/2016/ink" xmlns:am3d="http://schemas.microsoft.com/office/drawing/2017/model3d" xmlns:o="urn:schemas-microsoft-com:office:office" xmlns:oel="http://schemas.microsoft.com/office/2019/extlst" xmlns:r="http://schemas.openxmlformats.org/officeDocument/2006/relationships" xmlns:m="http://schemas.openxmlformats.org/officeDocument/2006/math" xmlns:v="urn:schemas-microsoft-com:vml" xmlns:wp14="http://schemas.microsoft.com/office/word/2010/wordprocessingDrawing" xmlns:wp="http://schemas.openxmlformats.org/drawingml/2006/wordprocessingDrawing" xmlns:w10="urn:schemas-microsoft-com:office:word" xmlns:w="http://schemas.openxmlformats.org/wordprocessingml/2006/main" xmlns:w14="http://schemas.microsoft.com/office/word/2010/wordml" xmlns:w15="http://schemas.microsoft.com/office/word/2012/wordml" xmlns:w16cei="http://schemas.microsoft.com/office/word/2026/wordml/cei" xmlns:w16cex="http://schemas.microsoft.com/office/word/2018/wordml/cex" xmlns:w16cid="http://schemas.microsoft.com/office/word/2016/wordml/cid" xmlns:w16="http://schemas.microsoft.com/office/word/2018/wordml" xmlns:w16du="http://schemas.microsoft.com/office/word/2023/wordml/word16du" xmlns:w16sdtdh="http://schemas.microsoft.com/office/word/2020/wordml/sdtdatahash" xmlns:w16sdtfl="http://schemas.microsoft.com/office/word/2024/wordml/sdtformatlock" xmlns:w16se="http://schemas.microsoft.com/office/word/2015/wordml/symex" xmlns:wpg="http://schemas.microsoft.com/office/word/2010/wordprocessingGroup" xmlns:wpi="http://schemas.microsoft.com/office/word/2010/wordprocessingInk" xmlns:wne="http://schemas.microsoft.com/office/word/2006/wordml" xmlns:wps="http://schemas.microsoft.com/office/word/2010/wordprocessingShape" mc:Ignorable="w14 w15 w16se w16cid w16 w16cex w16sdtdh w16sdtfl w16du wp14">
+<w:numbering xmlns:wpc="http://schemas.microsoft.com/office/word/2010/wordprocessingCanvas" xmlns:cx="http://schemas.microsoft.com/office/drawing/2014/chartex" xmlns:cx1="http://schemas.microsoft.com/office/drawing/2015/9/8/chartex" xmlns:cx2="http://schemas.microsoft.com/office/drawing/2015/10/21/chartex" xmlns:cx3="http://schemas.microsoft.com/office/drawing/2016/5/9/chartex" xmlns:cx4="http://schemas.microsoft.com/office/drawing/2016/5/10/chartex" xmlns:cx5="http://schemas.microsoft.com/office/drawing/2016/5/11/chartex" xmlns:cx6="http://schemas.microsoft.com/office/drawing/2016/5/12/chartex" xmlns:cx7="http://schemas.microsoft.com/office/drawing/2016/5/13/chartex" xmlns:cx8="http://schemas.microsoft.com/office/drawing/2016/5/14/chartex" xmlns:mc="http://schemas.openxmlformats.org/markup-compatibility/2006" xmlns:aink="http://schemas.microsoft.com/office/drawing/2016/ink" xmlns:am3d="http://schemas.microsoft.com/office/drawing/2017/model3d" xmlns:o="urn:schemas-microsoft-com:office:office" xmlns:oel="http://schemas.microsoft.com/office/2019/extlst" xmlns:r="http://schemas.openxmlformats.org/officeDocument/2006/relationships" xmlns:m="http://schemas.openxmlformats.org/officeDocument/2006/math" xmlns:v="urn:schemas-microsoft-com:vml" xmlns:wp14="http://schemas.microsoft.com/office/word/2010/wordprocessingDrawing" xmlns:wp="http://schemas.openxmlformats.org/drawingml/2006/wordprocessingDrawing" xmlns:w10="urn:schemas-microsoft-com:office:word" xmlns:w="http://schemas.openxmlformats.org/wordprocessingml/2006/main" xmlns:w14="http://schemas.microsoft.com/office/word/2010/wordml" xmlns:w15="http://schemas.microsoft.com/office/word/2012/wordml" xmlns:w16cex="http://schemas.microsoft.com/office/word/2018/wordml/cex" xmlns:w16cid="http://schemas.microsoft.com/office/word/2016/wordml/cid" xmlns:w16="http://schemas.microsoft.com/office/word/2018/wordml" xmlns:w16du="http://schemas.microsoft.com/office/word/2023/wordml/word16du" xmlns:w16sdtdh="http://schemas.microsoft.com/office/word/2020/wordml/sdtdatahash" xmlns:w16sdtfl="http://schemas.microsoft.com/office/word/2024/wordml/sdtformatlock" xmlns:w16se="http://schemas.microsoft.com/office/word/2015/wordml/symex" xmlns:wpg="http://schemas.microsoft.com/office/word/2010/wordprocessingGroup" xmlns:wpi="http://schemas.microsoft.com/office/word/2010/wordprocessingInk" xmlns:wne="http://schemas.microsoft.com/office/word/2006/wordml" xmlns:wps="http://schemas.microsoft.com/office/word/2010/wordprocessingShape" mc:Ignorable="w14 w15 w16se w16cid w16 w16cex w16sdtdh w16sdtfl w16du wp14">
   <w:abstractNum w:abstractNumId="0" w15:restartNumberingAfterBreak="0">
     <w:nsid w:val="0C803C44"/>
     <w:multiLevelType w:val="hybridMultilevel"/>
@@ -8788,6 +8681,119 @@
     </w:lvl>
   </w:abstractNum>
   <w:abstractNum w:abstractNumId="27" w15:restartNumberingAfterBreak="0">
+    <w:nsid w:val="6BD17EE7"/>
+    <w:multiLevelType w:val="hybridMultilevel"/>
+    <w:tmpl w:val="758E5E52"/>
+    <w:lvl w:ilvl="0" w:tplc="04090001">
+      <w:start w:val="1"/>
+      <w:numFmt w:val="bullet"/>
+      <w:lvlText w:val=""/>
+      <w:lvlJc w:val="left"/>
+      <w:pPr>
+        <w:ind w:left="440" w:hanging="440"/>
+      </w:pPr>
+      <w:rPr>
+        <w:rFonts w:ascii="Wingdings" w:hAnsi="Wingdings" w:hint="default"/>
+      </w:rPr>
+    </w:lvl>
+    <w:lvl w:ilvl="1" w:tplc="04090003" w:tentative="1">
+      <w:start w:val="1"/>
+      <w:numFmt w:val="bullet"/>
+      <w:lvlText w:val=""/>
+      <w:lvlJc w:val="left"/>
+      <w:pPr>
+        <w:ind w:left="880" w:hanging="440"/>
+      </w:pPr>
+      <w:rPr>
+        <w:rFonts w:ascii="Wingdings" w:hAnsi="Wingdings" w:hint="default"/>
+      </w:rPr>
+    </w:lvl>
+    <w:lvl w:ilvl="2" w:tplc="04090005" w:tentative="1">
+      <w:start w:val="1"/>
+      <w:numFmt w:val="bullet"/>
+      <w:lvlText w:val=""/>
+      <w:lvlJc w:val="left"/>
+      <w:pPr>
+        <w:ind w:left="1320" w:hanging="440"/>
+      </w:pPr>
+      <w:rPr>
+        <w:rFonts w:ascii="Wingdings" w:hAnsi="Wingdings" w:hint="default"/>
+      </w:rPr>
+    </w:lvl>
+    <w:lvl w:ilvl="3" w:tplc="04090001" w:tentative="1">
+      <w:start w:val="1"/>
+      <w:numFmt w:val="bullet"/>
+      <w:lvlText w:val=""/>
+      <w:lvlJc w:val="left"/>
+      <w:pPr>
+        <w:ind w:left="1760" w:hanging="440"/>
+      </w:pPr>
+      <w:rPr>
+        <w:rFonts w:ascii="Wingdings" w:hAnsi="Wingdings" w:hint="default"/>
+      </w:rPr>
+    </w:lvl>
+    <w:lvl w:ilvl="4" w:tplc="04090003" w:tentative="1">
+      <w:start w:val="1"/>
+      <w:numFmt w:val="bullet"/>
+      <w:lvlText w:val=""/>
+      <w:lvlJc w:val="left"/>
+      <w:pPr>
+        <w:ind w:left="2200" w:hanging="440"/>
+      </w:pPr>
+      <w:rPr>
+        <w:rFonts w:ascii="Wingdings" w:hAnsi="Wingdings" w:hint="default"/>
+      </w:rPr>
+    </w:lvl>
+    <w:lvl w:ilvl="5" w:tplc="04090005" w:tentative="1">
+      <w:start w:val="1"/>
+      <w:numFmt w:val="bullet"/>
+      <w:lvlText w:val=""/>
+      <w:lvlJc w:val="left"/>
+      <w:pPr>
+        <w:ind w:left="2640" w:hanging="440"/>
+      </w:pPr>
+      <w:rPr>
+        <w:rFonts w:ascii="Wingdings" w:hAnsi="Wingdings" w:hint="default"/>
+      </w:rPr>
+    </w:lvl>
+    <w:lvl w:ilvl="6" w:tplc="04090001" w:tentative="1">
+      <w:start w:val="1"/>
+      <w:numFmt w:val="bullet"/>
+      <w:lvlText w:val=""/>
+      <w:lvlJc w:val="left"/>
+      <w:pPr>
+        <w:ind w:left="3080" w:hanging="440"/>
+      </w:pPr>
+      <w:rPr>
+        <w:rFonts w:ascii="Wingdings" w:hAnsi="Wingdings" w:hint="default"/>
+      </w:rPr>
+    </w:lvl>
+    <w:lvl w:ilvl="7" w:tplc="04090003" w:tentative="1">
+      <w:start w:val="1"/>
+      <w:numFmt w:val="bullet"/>
+      <w:lvlText w:val=""/>
+      <w:lvlJc w:val="left"/>
+      <w:pPr>
+        <w:ind w:left="3520" w:hanging="440"/>
+      </w:pPr>
+      <w:rPr>
+        <w:rFonts w:ascii="Wingdings" w:hAnsi="Wingdings" w:hint="default"/>
+      </w:rPr>
+    </w:lvl>
+    <w:lvl w:ilvl="8" w:tplc="04090005" w:tentative="1">
+      <w:start w:val="1"/>
+      <w:numFmt w:val="bullet"/>
+      <w:lvlText w:val=""/>
+      <w:lvlJc w:val="left"/>
+      <w:pPr>
+        <w:ind w:left="3960" w:hanging="440"/>
+      </w:pPr>
+      <w:rPr>
+        <w:rFonts w:ascii="Wingdings" w:hAnsi="Wingdings" w:hint="default"/>
+      </w:rPr>
+    </w:lvl>
+  </w:abstractNum>
+  <w:abstractNum w:abstractNumId="28" w15:restartNumberingAfterBreak="0">
     <w:nsid w:val="6E1C6D64"/>
     <w:multiLevelType w:val="hybridMultilevel"/>
     <w:tmpl w:val="A9D27AF6"/>
@@ -8900,7 +8906,7 @@
       </w:rPr>
     </w:lvl>
   </w:abstractNum>
-  <w:abstractNum w:abstractNumId="28" w15:restartNumberingAfterBreak="0">
+  <w:abstractNum w:abstractNumId="29" w15:restartNumberingAfterBreak="0">
     <w:nsid w:val="6F3C23BF"/>
     <w:multiLevelType w:val="multilevel"/>
     <w:tmpl w:val="B8485906"/>
@@ -8990,7 +8996,7 @@
       </w:pPr>
     </w:lvl>
   </w:abstractNum>
-  <w:abstractNum w:abstractNumId="29" w15:restartNumberingAfterBreak="0">
+  <w:abstractNum w:abstractNumId="30" w15:restartNumberingAfterBreak="0">
     <w:nsid w:val="75A335FC"/>
     <w:multiLevelType w:val="hybridMultilevel"/>
     <w:tmpl w:val="60EA801C"/>
@@ -9079,7 +9085,7 @@
       </w:pPr>
     </w:lvl>
   </w:abstractNum>
-  <w:abstractNum w:abstractNumId="30" w15:restartNumberingAfterBreak="0">
+  <w:abstractNum w:abstractNumId="31" w15:restartNumberingAfterBreak="0">
     <w:nsid w:val="786227EB"/>
     <w:multiLevelType w:val="hybridMultilevel"/>
     <w:tmpl w:val="0E7E6694"/>
@@ -9168,7 +9174,7 @@
       </w:pPr>
     </w:lvl>
   </w:abstractNum>
-  <w:abstractNum w:abstractNumId="31" w15:restartNumberingAfterBreak="0">
+  <w:abstractNum w:abstractNumId="32" w15:restartNumberingAfterBreak="0">
     <w:nsid w:val="788D7927"/>
     <w:multiLevelType w:val="hybridMultilevel"/>
     <w:tmpl w:val="0DE09A92"/>
@@ -9258,7 +9264,7 @@
       </w:pPr>
     </w:lvl>
   </w:abstractNum>
-  <w:abstractNum w:abstractNumId="32" w15:restartNumberingAfterBreak="0">
+  <w:abstractNum w:abstractNumId="33" w15:restartNumberingAfterBreak="0">
     <w:nsid w:val="79C37B73"/>
     <w:multiLevelType w:val="hybridMultilevel"/>
     <w:tmpl w:val="BBC4D5C8"/>
@@ -9374,7 +9380,7 @@
       </w:rPr>
     </w:lvl>
   </w:abstractNum>
-  <w:abstractNum w:abstractNumId="33" w15:restartNumberingAfterBreak="0">
+  <w:abstractNum w:abstractNumId="34" w15:restartNumberingAfterBreak="0">
     <w:nsid w:val="7A486DA3"/>
     <w:multiLevelType w:val="hybridMultilevel"/>
     <w:tmpl w:val="0DE09A92"/>
@@ -9464,7 +9470,7 @@
       </w:pPr>
     </w:lvl>
   </w:abstractNum>
-  <w:abstractNum w:abstractNumId="34" w15:restartNumberingAfterBreak="0">
+  <w:abstractNum w:abstractNumId="35" w15:restartNumberingAfterBreak="0">
     <w:nsid w:val="7E653CAF"/>
     <w:multiLevelType w:val="hybridMultilevel"/>
     <w:tmpl w:val="0DE09A92"/>
@@ -9558,10 +9564,10 @@
     <w:abstractNumId w:val="24"/>
   </w:num>
   <w:num w:numId="2" w16cid:durableId="1221869738">
-    <w:abstractNumId w:val="27"/>
+    <w:abstractNumId w:val="28"/>
   </w:num>
   <w:num w:numId="3" w16cid:durableId="1609772055">
-    <w:abstractNumId w:val="32"/>
+    <w:abstractNumId w:val="33"/>
   </w:num>
   <w:num w:numId="4" w16cid:durableId="963581901">
     <w:abstractNumId w:val="1"/>
@@ -9570,7 +9576,7 @@
     <w:abstractNumId w:val="19"/>
   </w:num>
   <w:num w:numId="6" w16cid:durableId="905839176">
-    <w:abstractNumId w:val="29"/>
+    <w:abstractNumId w:val="30"/>
   </w:num>
   <w:num w:numId="7" w16cid:durableId="104692095">
     <w:abstractNumId w:val="22"/>
@@ -9594,7 +9600,7 @@
     <w:abstractNumId w:val="20"/>
   </w:num>
   <w:num w:numId="14" w16cid:durableId="1466318354">
-    <w:abstractNumId w:val="28"/>
+    <w:abstractNumId w:val="29"/>
   </w:num>
   <w:num w:numId="15" w16cid:durableId="1247375783">
     <w:abstractNumId w:val="7"/>
@@ -9618,7 +9624,7 @@
     <w:abstractNumId w:val="18"/>
   </w:num>
   <w:num w:numId="22" w16cid:durableId="2132897834">
-    <w:abstractNumId w:val="33"/>
+    <w:abstractNumId w:val="34"/>
   </w:num>
   <w:num w:numId="23" w16cid:durableId="1775007205">
     <w:abstractNumId w:val="3"/>
@@ -9633,7 +9639,7 @@
     <w:abstractNumId w:val="9"/>
   </w:num>
   <w:num w:numId="27" w16cid:durableId="1609660383">
-    <w:abstractNumId w:val="31"/>
+    <w:abstractNumId w:val="32"/>
   </w:num>
   <w:num w:numId="28" w16cid:durableId="151875723">
     <w:abstractNumId w:val="25"/>
@@ -9645,19 +9651,22 @@
     <w:abstractNumId w:val="8"/>
   </w:num>
   <w:num w:numId="31" w16cid:durableId="928276895">
-    <w:abstractNumId w:val="34"/>
+    <w:abstractNumId w:val="35"/>
   </w:num>
   <w:num w:numId="32" w16cid:durableId="96407470">
     <w:abstractNumId w:val="2"/>
   </w:num>
   <w:num w:numId="33" w16cid:durableId="705057257">
-    <w:abstractNumId w:val="30"/>
+    <w:abstractNumId w:val="31"/>
   </w:num>
   <w:num w:numId="34" w16cid:durableId="732968959">
     <w:abstractNumId w:val="13"/>
   </w:num>
   <w:num w:numId="35" w16cid:durableId="946891666">
     <w:abstractNumId w:val="23"/>
+  </w:num>
+  <w:num w:numId="36" w16cid:durableId="1790659427">
+    <w:abstractNumId w:val="27"/>
   </w:num>
 </w:numbering>
 </file>
@@ -10066,6 +10075,7 @@
   <w:style w:type="character" w:default="1" w:styleId="a0">
     <w:name w:val="Default Paragraph Font"/>
     <w:uiPriority w:val="1"/>
+    <w:semiHidden/>
     <w:unhideWhenUsed/>
   </w:style>
   <w:style w:type="table" w:default="1" w:styleId="a1">

</xml_diff>